<commit_message>
* Released v0.9.7 * Help * History * Minor
</commit_message>
<xml_diff>
--- a/IDM BUILD_7/Help/Help.docx
+++ b/IDM BUILD_7/Help/Help.docx
@@ -18,7 +18,7 @@
           <w:lang w:bidi="ar-SA"/>
         </w:rPr>
         <w:drawing>
-          <wp:anchor distT="0" distB="0" distL="114300" distR="114300" simplePos="0" relativeHeight="251659264" behindDoc="0" locked="0" layoutInCell="1" allowOverlap="1">
+          <wp:anchor distT="0" distB="0" distL="114300" distR="114300" simplePos="0" relativeHeight="251659264" behindDoc="0" locked="0" layoutInCell="1" allowOverlap="1" wp14:anchorId="10914DD8" wp14:editId="31640088">
             <wp:simplePos x="0" y="0"/>
             <wp:positionH relativeFrom="column">
               <wp:posOffset>38100</wp:posOffset>
@@ -215,7 +215,7 @@
         <w:pStyle w:val="ListParagraph"/>
         <w:numPr>
           <w:ilvl w:val="0"/>
-          <w:numId w:val="1"/>
+          <w:numId w:val="21"/>
         </w:numPr>
         <w:spacing w:line="240" w:lineRule="auto"/>
         <w:rPr>
@@ -241,7 +241,7 @@
         <w:pStyle w:val="ListParagraph"/>
         <w:numPr>
           <w:ilvl w:val="0"/>
-          <w:numId w:val="1"/>
+          <w:numId w:val="21"/>
         </w:numPr>
         <w:spacing w:line="240" w:lineRule="auto"/>
         <w:rPr>
@@ -267,7 +267,7 @@
         <w:pStyle w:val="ListParagraph"/>
         <w:numPr>
           <w:ilvl w:val="0"/>
-          <w:numId w:val="1"/>
+          <w:numId w:val="21"/>
         </w:numPr>
         <w:spacing w:line="240" w:lineRule="auto"/>
         <w:rPr>
@@ -293,7 +293,7 @@
         <w:pStyle w:val="ListParagraph"/>
         <w:numPr>
           <w:ilvl w:val="0"/>
-          <w:numId w:val="1"/>
+          <w:numId w:val="21"/>
         </w:numPr>
         <w:spacing w:line="240" w:lineRule="auto"/>
         <w:rPr>
@@ -319,7 +319,7 @@
         <w:pStyle w:val="ListParagraph"/>
         <w:numPr>
           <w:ilvl w:val="1"/>
-          <w:numId w:val="1"/>
+          <w:numId w:val="21"/>
         </w:numPr>
         <w:spacing w:line="240" w:lineRule="auto"/>
         <w:rPr>
@@ -336,16 +336,7 @@
             <w:sz w:val="24"/>
             <w:szCs w:val="24"/>
           </w:rPr>
-          <w:t>Backing up</w:t>
-        </w:r>
-        <w:r>
-          <w:rPr>
-            <w:rStyle w:val="Hyperlink"/>
-            <w:rFonts w:cs="Times New Roman"/>
-            <w:sz w:val="24"/>
-            <w:szCs w:val="24"/>
-          </w:rPr>
-          <w:t xml:space="preserve"> IDM</w:t>
+          <w:t>Backing up IDM</w:t>
         </w:r>
       </w:hyperlink>
     </w:p>
@@ -354,7 +345,7 @@
         <w:pStyle w:val="ListParagraph"/>
         <w:numPr>
           <w:ilvl w:val="2"/>
-          <w:numId w:val="1"/>
+          <w:numId w:val="21"/>
         </w:numPr>
         <w:spacing w:line="240" w:lineRule="auto"/>
         <w:rPr>
@@ -380,7 +371,7 @@
         <w:pStyle w:val="ListParagraph"/>
         <w:numPr>
           <w:ilvl w:val="2"/>
-          <w:numId w:val="1"/>
+          <w:numId w:val="21"/>
         </w:numPr>
         <w:spacing w:line="240" w:lineRule="auto"/>
         <w:rPr>
@@ -406,7 +397,7 @@
         <w:pStyle w:val="ListParagraph"/>
         <w:numPr>
           <w:ilvl w:val="2"/>
-          <w:numId w:val="1"/>
+          <w:numId w:val="21"/>
         </w:numPr>
         <w:spacing w:line="240" w:lineRule="auto"/>
         <w:rPr>
@@ -432,7 +423,7 @@
         <w:pStyle w:val="ListParagraph"/>
         <w:numPr>
           <w:ilvl w:val="1"/>
-          <w:numId w:val="1"/>
+          <w:numId w:val="21"/>
         </w:numPr>
         <w:spacing w:line="240" w:lineRule="auto"/>
         <w:rPr>
@@ -458,7 +449,7 @@
         <w:pStyle w:val="ListParagraph"/>
         <w:numPr>
           <w:ilvl w:val="1"/>
-          <w:numId w:val="1"/>
+          <w:numId w:val="21"/>
         </w:numPr>
         <w:spacing w:line="240" w:lineRule="auto"/>
         <w:rPr>
@@ -484,7 +475,7 @@
         <w:pStyle w:val="ListParagraph"/>
         <w:numPr>
           <w:ilvl w:val="2"/>
-          <w:numId w:val="1"/>
+          <w:numId w:val="21"/>
         </w:numPr>
         <w:spacing w:line="240" w:lineRule="auto"/>
         <w:rPr>
@@ -510,7 +501,7 @@
         <w:pStyle w:val="ListParagraph"/>
         <w:numPr>
           <w:ilvl w:val="2"/>
-          <w:numId w:val="1"/>
+          <w:numId w:val="21"/>
         </w:numPr>
         <w:spacing w:line="240" w:lineRule="auto"/>
         <w:rPr>
@@ -527,7 +518,7 @@
             <w:sz w:val="24"/>
             <w:szCs w:val="24"/>
           </w:rPr>
-          <w:t>Joining File</w:t>
+          <w:t>Joining File(Experimental)</w:t>
         </w:r>
       </w:hyperlink>
     </w:p>
@@ -536,7 +527,7 @@
         <w:pStyle w:val="ListParagraph"/>
         <w:numPr>
           <w:ilvl w:val="2"/>
-          <w:numId w:val="1"/>
+          <w:numId w:val="21"/>
         </w:numPr>
         <w:spacing w:line="240" w:lineRule="auto"/>
         <w:rPr>
@@ -562,7 +553,7 @@
         <w:pStyle w:val="ListParagraph"/>
         <w:numPr>
           <w:ilvl w:val="2"/>
-          <w:numId w:val="1"/>
+          <w:numId w:val="21"/>
         </w:numPr>
         <w:spacing w:line="240" w:lineRule="auto"/>
         <w:rPr>
@@ -579,16 +570,7 @@
             <w:sz w:val="24"/>
             <w:szCs w:val="24"/>
           </w:rPr>
-          <w:t>Exporting</w:t>
-        </w:r>
-        <w:r>
-          <w:rPr>
-            <w:rStyle w:val="Hyperlink"/>
-            <w:rFonts w:cs="Times New Roman"/>
-            <w:sz w:val="24"/>
-            <w:szCs w:val="24"/>
-          </w:rPr>
-          <w:t xml:space="preserve"> List</w:t>
+          <w:t>Exporting List</w:t>
         </w:r>
       </w:hyperlink>
     </w:p>
@@ -597,7 +579,7 @@
         <w:pStyle w:val="ListParagraph"/>
         <w:numPr>
           <w:ilvl w:val="1"/>
-          <w:numId w:val="1"/>
+          <w:numId w:val="21"/>
         </w:numPr>
         <w:spacing w:line="240" w:lineRule="auto"/>
         <w:rPr>
@@ -623,7 +605,7 @@
         <w:pStyle w:val="ListParagraph"/>
         <w:numPr>
           <w:ilvl w:val="2"/>
-          <w:numId w:val="1"/>
+          <w:numId w:val="21"/>
         </w:numPr>
         <w:spacing w:line="240" w:lineRule="auto"/>
         <w:rPr>
@@ -649,16 +631,13 @@
         <w:pStyle w:val="ListParagraph"/>
         <w:numPr>
           <w:ilvl w:val="2"/>
-          <w:numId w:val="1"/>
+          <w:numId w:val="21"/>
         </w:numPr>
         <w:spacing w:line="240" w:lineRule="auto"/>
         <w:rPr>
-          <w:rStyle w:val="Hyperlink"/>
-          <w:rFonts w:cs="Times New Roman"/>
-          <w:color w:val="auto"/>
+          <w:rFonts w:cs="Times New Roman"/>
           <w:sz w:val="24"/>
           <w:szCs w:val="24"/>
-          <w:u w:val="none"/>
         </w:rPr>
       </w:pPr>
       <w:hyperlink w:anchor="_(ii)_Full_Clean" w:history="1">
@@ -677,8 +656,60 @@
       <w:pPr>
         <w:pStyle w:val="ListParagraph"/>
         <w:numPr>
+          <w:ilvl w:val="1"/>
+          <w:numId w:val="21"/>
+        </w:numPr>
+        <w:spacing w:line="240" w:lineRule="auto"/>
+        <w:rPr>
+          <w:rFonts w:cs="Times New Roman"/>
+          <w:sz w:val="24"/>
+          <w:szCs w:val="24"/>
+        </w:rPr>
+      </w:pPr>
+      <w:hyperlink w:anchor="_4.5_PASSWORD_CLEANER" w:history="1">
+        <w:r>
+          <w:rPr>
+            <w:rStyle w:val="Hyperlink"/>
+            <w:rFonts w:cs="Times New Roman"/>
+            <w:sz w:val="24"/>
+            <w:szCs w:val="24"/>
+          </w:rPr>
+          <w:t>Password Cleaner</w:t>
+        </w:r>
+      </w:hyperlink>
+    </w:p>
+    <w:p>
+      <w:pPr>
+        <w:pStyle w:val="ListParagraph"/>
+        <w:numPr>
+          <w:ilvl w:val="1"/>
+          <w:numId w:val="21"/>
+        </w:numPr>
+        <w:spacing w:line="240" w:lineRule="auto"/>
+        <w:rPr>
+          <w:rFonts w:cs="Times New Roman"/>
+          <w:sz w:val="24"/>
+          <w:szCs w:val="24"/>
+        </w:rPr>
+      </w:pPr>
+      <w:hyperlink w:anchor="_4.6_Add_Extra" w:history="1">
+        <w:r>
+          <w:rPr>
+            <w:rStyle w:val="Hyperlink"/>
+            <w:rFonts w:cs="Times New Roman"/>
+            <w:sz w:val="24"/>
+            <w:szCs w:val="24"/>
+          </w:rPr>
+          <w:t>Add Extra Files Types</w:t>
+        </w:r>
+      </w:hyperlink>
+    </w:p>
+    <w:p>
+      <w:pPr>
+        <w:pStyle w:val="ListParagraph"/>
+        <w:numPr>
           <w:ilvl w:val="0"/>
-          <w:numId w:val="1"/>
+          <w:numId w:val="21"/>
         </w:numPr>
         <w:spacing w:line="240" w:lineRule="auto"/>
         <w:rPr>
@@ -704,7 +735,7 @@
         <w:pStyle w:val="ListParagraph"/>
         <w:numPr>
           <w:ilvl w:val="0"/>
-          <w:numId w:val="1"/>
+          <w:numId w:val="21"/>
         </w:numPr>
         <w:spacing w:line="240" w:lineRule="auto"/>
         <w:rPr>
@@ -721,43 +752,7 @@
             <w:sz w:val="24"/>
             <w:szCs w:val="24"/>
           </w:rPr>
-          <w:t>FAQ</w:t>
-        </w:r>
-        <w:r>
-          <w:rPr>
-            <w:rStyle w:val="Hyperlink"/>
-            <w:rFonts w:cs="Times New Roman"/>
-            <w:sz w:val="24"/>
-            <w:szCs w:val="24"/>
-          </w:rPr>
-          <w:t xml:space="preserve"> </w:t>
-        </w:r>
-        <w:r>
-          <w:rPr>
-            <w:rStyle w:val="Hyperlink"/>
-            <w:rFonts w:cs="Times New Roman"/>
-            <w:sz w:val="24"/>
-            <w:szCs w:val="24"/>
-          </w:rPr>
-          <w:t xml:space="preserve">S and </w:t>
-        </w:r>
-        <w:r>
-          <w:rPr>
-            <w:rStyle w:val="Hyperlink"/>
-            <w:rFonts w:cs="Times New Roman"/>
-            <w:sz w:val="24"/>
-            <w:szCs w:val="24"/>
-          </w:rPr>
-          <w:t>Important</w:t>
-        </w:r>
-        <w:r>
-          <w:rPr>
-            <w:rStyle w:val="Hyperlink"/>
-            <w:rFonts w:cs="Times New Roman"/>
-            <w:sz w:val="24"/>
-            <w:szCs w:val="24"/>
-          </w:rPr>
-          <w:t xml:space="preserve"> Notes</w:t>
+          <w:t>FAQ S and Important Notes</w:t>
         </w:r>
       </w:hyperlink>
     </w:p>
@@ -766,7 +761,7 @@
         <w:pStyle w:val="ListParagraph"/>
         <w:numPr>
           <w:ilvl w:val="0"/>
-          <w:numId w:val="1"/>
+          <w:numId w:val="21"/>
         </w:numPr>
         <w:spacing w:line="240" w:lineRule="auto"/>
         <w:rPr>
@@ -775,7 +770,7 @@
           <w:szCs w:val="24"/>
         </w:rPr>
       </w:pPr>
-      <w:hyperlink w:anchor="_6._Support,_Contact" w:history="1">
+      <w:hyperlink w:anchor="_7._Support,_Contact" w:history="1">
         <w:r>
           <w:rPr>
             <w:rStyle w:val="Hyperlink"/>
@@ -804,7 +799,7 @@
           <w:lang w:bidi="ar-SA"/>
         </w:rPr>
         <w:drawing>
-          <wp:inline distT="0" distB="0" distL="0" distR="0" wp14:anchorId="17574869" wp14:editId="0A81A842">
+          <wp:inline distT="0" distB="0" distL="0" distR="0" wp14:anchorId="2A107EF9" wp14:editId="55E3F158">
             <wp:extent cx="190500" cy="190500"/>
             <wp:effectExtent l="0" t="0" r="0" b="0"/>
             <wp:docPr id="1" name="Picture 0" descr="thumbs_up.gif">
@@ -924,7 +919,7 @@
           <w:lang w:bidi="ar-SA"/>
         </w:rPr>
         <w:drawing>
-          <wp:inline distT="0" distB="0" distL="0" distR="0" wp14:anchorId="2B20A3BA" wp14:editId="1E35CF71">
+          <wp:inline distT="0" distB="0" distL="0" distR="0" wp14:anchorId="24AEA379" wp14:editId="5AC21F04">
             <wp:extent cx="190500" cy="190500"/>
             <wp:effectExtent l="0" t="0" r="0" b="0"/>
             <wp:docPr id="2" name="Picture 0" descr="thumbs_up.gif">
@@ -1207,6 +1202,7 @@
         <w:rPr>
           <w:rFonts w:cs="Times New Roman"/>
         </w:rPr>
+        <w:lastRenderedPageBreak/>
         <w:t xml:space="preserve">Download List Manager is allow to use Force to Join Unfinished Downloaded Files, Expert in various format, Remove Download </w:t>
       </w:r>
       <w:r>
@@ -1270,7 +1266,7 @@
           <w:lang w:bidi="ar-SA"/>
         </w:rPr>
         <w:drawing>
-          <wp:inline distT="0" distB="0" distL="0" distR="0" wp14:anchorId="1163F6B9" wp14:editId="42FCD46C">
+          <wp:inline distT="0" distB="0" distL="0" distR="0" wp14:anchorId="642CAFEC" wp14:editId="2165D7EA">
             <wp:extent cx="190500" cy="190500"/>
             <wp:effectExtent l="0" t="0" r="0" b="0"/>
             <wp:docPr id="11" name="Picture 0" descr="thumbs_up.gif">
@@ -1444,7 +1440,7 @@
           <w:lang w:bidi="ar-SA"/>
         </w:rPr>
         <w:drawing>
-          <wp:inline distT="0" distB="0" distL="0" distR="0" wp14:anchorId="786E1C6E" wp14:editId="3345A910">
+          <wp:inline distT="0" distB="0" distL="0" distR="0" wp14:anchorId="5B18E40E" wp14:editId="64F1C1D4">
             <wp:extent cx="190500" cy="190500"/>
             <wp:effectExtent l="0" t="0" r="0" b="0"/>
             <wp:docPr id="12" name="Picture 0" descr="thumbs_up.gif">
@@ -1487,8 +1483,10 @@
         <w:pStyle w:val="Heading2"/>
       </w:pPr>
       <w:bookmarkStart w:id="10" w:name="_(a)_Backing_up"/>
-      <w:bookmarkStart w:id="11" w:name="_Toc338444607"/>
+      <w:bookmarkStart w:id="11" w:name="_4.1_Backing_up"/>
+      <w:bookmarkStart w:id="12" w:name="_Toc338444607"/>
       <w:bookmarkEnd w:id="10"/>
+      <w:bookmarkEnd w:id="11"/>
       <w:r>
         <w:t>4.1</w:t>
       </w:r>
@@ -1501,15 +1499,17 @@
       <w:r>
         <w:t xml:space="preserve"> IDM</w:t>
       </w:r>
-      <w:bookmarkEnd w:id="11"/>
+      <w:bookmarkEnd w:id="12"/>
     </w:p>
     <w:p>
       <w:pPr>
         <w:pStyle w:val="Heading3"/>
       </w:pPr>
-      <w:bookmarkStart w:id="12" w:name="_(i)_Full_Backup"/>
-      <w:bookmarkStart w:id="13" w:name="_Toc338444608"/>
-      <w:bookmarkEnd w:id="12"/>
+      <w:bookmarkStart w:id="13" w:name="_(i)_Full_Backup"/>
+      <w:bookmarkStart w:id="14" w:name="_4.1.1_Full_Backup"/>
+      <w:bookmarkStart w:id="15" w:name="_Toc338444608"/>
+      <w:bookmarkEnd w:id="13"/>
+      <w:bookmarkEnd w:id="14"/>
       <w:r>
         <w:t>4.1.1</w:t>
       </w:r>
@@ -1519,7 +1519,7 @@
       <w:r>
         <w:t>Full Backup</w:t>
       </w:r>
-      <w:bookmarkEnd w:id="13"/>
+      <w:bookmarkEnd w:id="15"/>
     </w:p>
     <w:p>
       <w:pPr>
@@ -1548,9 +1548,9 @@
           <w:lang w:bidi="ar-SA"/>
         </w:rPr>
         <w:drawing>
-          <wp:inline distT="0" distB="0" distL="0" distR="0" wp14:anchorId="1273A375" wp14:editId="79526E68">
-            <wp:extent cx="4239217" cy="2896003"/>
-            <wp:effectExtent l="0" t="0" r="9525" b="0"/>
+          <wp:inline distT="0" distB="0" distL="0" distR="0" wp14:anchorId="29A5CC91" wp14:editId="58A59564">
+            <wp:extent cx="4184160" cy="2896002"/>
+            <wp:effectExtent l="0" t="0" r="6985" b="0"/>
             <wp:docPr id="3" name="Picture 2"/>
             <wp:cNvGraphicFramePr>
               <a:graphicFrameLocks xmlns:a="http://schemas.openxmlformats.org/drawingml/2006/main" noChangeAspect="1"/>
@@ -1577,7 +1577,7 @@
                   <pic:spPr>
                     <a:xfrm>
                       <a:off x="0" y="0"/>
-                      <a:ext cx="4239217" cy="2896003"/>
+                      <a:ext cx="4184160" cy="2896002"/>
                     </a:xfrm>
                     <a:prstGeom prst="rect">
                       <a:avLst/>
@@ -1746,9 +1746,11 @@
       <w:pPr>
         <w:pStyle w:val="Heading3"/>
       </w:pPr>
-      <w:bookmarkStart w:id="14" w:name="_(ii)_Custom_Backup"/>
-      <w:bookmarkStart w:id="15" w:name="_Toc338444609"/>
-      <w:bookmarkEnd w:id="14"/>
+      <w:bookmarkStart w:id="16" w:name="_(ii)_Custom_Backup"/>
+      <w:bookmarkStart w:id="17" w:name="_4.1.2_Custom_Backup"/>
+      <w:bookmarkStart w:id="18" w:name="_Toc338444609"/>
+      <w:bookmarkEnd w:id="16"/>
+      <w:bookmarkEnd w:id="17"/>
       <w:r>
         <w:t>4.1.2</w:t>
       </w:r>
@@ -1758,7 +1760,7 @@
       <w:r>
         <w:t>Custom Backup</w:t>
       </w:r>
-      <w:bookmarkEnd w:id="15"/>
+      <w:bookmarkEnd w:id="18"/>
     </w:p>
     <w:p>
       <w:pPr>
@@ -1774,10 +1776,10 @@
           <w:lang w:bidi="ar-SA"/>
         </w:rPr>
         <w:drawing>
-          <wp:inline distT="0" distB="0" distL="0" distR="0" wp14:anchorId="6A6280BE" wp14:editId="5FF1E7B1">
-            <wp:extent cx="2010056" cy="609685"/>
-            <wp:effectExtent l="0" t="0" r="9525" b="0"/>
-            <wp:docPr id="4" name="Picture 3" descr="Custom Backup" title="Custom Backup"/>
+          <wp:inline distT="0" distB="0" distL="0" distR="0" wp14:anchorId="6360F870" wp14:editId="1A27DC19">
+            <wp:extent cx="2010056" cy="555775"/>
+            <wp:effectExtent l="0" t="0" r="0" b="0"/>
+            <wp:docPr id="4" name="Picture 3"/>
             <wp:cNvGraphicFramePr>
               <a:graphicFrameLocks xmlns:a="http://schemas.openxmlformats.org/drawingml/2006/main" noChangeAspect="1"/>
             </wp:cNvGraphicFramePr>
@@ -1789,7 +1791,13 @@
                     <pic:cNvPicPr/>
                   </pic:nvPicPr>
                   <pic:blipFill>
-                    <a:blip r:embed="rId12"/>
+                    <a:blip r:embed="rId12">
+                      <a:extLst>
+                        <a:ext uri="{28A0092B-C50C-407E-A947-70E740481C1C}">
+                          <a14:useLocalDpi xmlns:a14="http://schemas.microsoft.com/office/drawing/2010/main" val="0"/>
+                        </a:ext>
+                      </a:extLst>
+                    </a:blip>
                     <a:stretch>
                       <a:fillRect/>
                     </a:stretch>
@@ -1797,7 +1805,7 @@
                   <pic:spPr>
                     <a:xfrm>
                       <a:off x="0" y="0"/>
-                      <a:ext cx="2010056" cy="609685"/>
+                      <a:ext cx="2010056" cy="555775"/>
                     </a:xfrm>
                     <a:prstGeom prst="rect">
                       <a:avLst/>
@@ -1829,6 +1837,7 @@
         <w:rPr>
           <w:rFonts w:cs="Times New Roman"/>
         </w:rPr>
+        <w:lastRenderedPageBreak/>
         <w:t xml:space="preserve">Choose </w:t>
       </w:r>
       <w:r>
@@ -1938,16 +1947,18 @@
       <w:pPr>
         <w:pStyle w:val="Heading3"/>
       </w:pPr>
-      <w:bookmarkStart w:id="16" w:name="_(iii)_List_Backup"/>
-      <w:bookmarkStart w:id="17" w:name="_Toc338444610"/>
-      <w:bookmarkEnd w:id="16"/>
+      <w:bookmarkStart w:id="19" w:name="_(iii)_List_Backup"/>
+      <w:bookmarkStart w:id="20" w:name="_4.1.3_List_Backup"/>
+      <w:bookmarkStart w:id="21" w:name="_Toc338444610"/>
+      <w:bookmarkEnd w:id="19"/>
+      <w:bookmarkEnd w:id="20"/>
       <w:r>
         <w:t>4.1.3</w:t>
       </w:r>
       <w:r>
         <w:t xml:space="preserve"> List Backup</w:t>
       </w:r>
-      <w:bookmarkEnd w:id="17"/>
+      <w:bookmarkEnd w:id="21"/>
     </w:p>
     <w:p>
       <w:pPr>
@@ -1963,10 +1974,10 @@
           <w:lang w:bidi="ar-SA"/>
         </w:rPr>
         <w:drawing>
-          <wp:inline distT="0" distB="0" distL="0" distR="0" wp14:anchorId="5E525601" wp14:editId="17BA4300">
-            <wp:extent cx="2010056" cy="609685"/>
-            <wp:effectExtent l="0" t="0" r="9525" b="0"/>
-            <wp:docPr id="5" name="Picture 4" descr="List Backup" title="List Backup"/>
+          <wp:inline distT="0" distB="0" distL="0" distR="0" wp14:anchorId="063364C8" wp14:editId="7CADFAE2">
+            <wp:extent cx="2010056" cy="570294"/>
+            <wp:effectExtent l="0" t="0" r="9525" b="1270"/>
+            <wp:docPr id="5" name="Picture 4"/>
             <wp:cNvGraphicFramePr>
               <a:graphicFrameLocks xmlns:a="http://schemas.openxmlformats.org/drawingml/2006/main" noChangeAspect="1"/>
             </wp:cNvGraphicFramePr>
@@ -1978,7 +1989,13 @@
                     <pic:cNvPicPr/>
                   </pic:nvPicPr>
                   <pic:blipFill>
-                    <a:blip r:embed="rId13"/>
+                    <a:blip r:embed="rId13">
+                      <a:extLst>
+                        <a:ext uri="{28A0092B-C50C-407E-A947-70E740481C1C}">
+                          <a14:useLocalDpi xmlns:a14="http://schemas.microsoft.com/office/drawing/2010/main" val="0"/>
+                        </a:ext>
+                      </a:extLst>
+                    </a:blip>
                     <a:stretch>
                       <a:fillRect/>
                     </a:stretch>
@@ -1986,7 +2003,7 @@
                   <pic:spPr>
                     <a:xfrm>
                       <a:off x="0" y="0"/>
-                      <a:ext cx="2010056" cy="609685"/>
+                      <a:ext cx="2010056" cy="570294"/>
                     </a:xfrm>
                     <a:prstGeom prst="rect">
                       <a:avLst/>
@@ -2106,8 +2123,18 @@
           <w:b/>
           <w:color w:val="FF0000"/>
         </w:rPr>
-        <w:t>no data will backup</w:t>
-      </w:r>
+        <w:t xml:space="preserve">no data will </w:t>
+      </w:r>
+      <w:proofErr w:type="spellStart"/>
+      <w:r>
+        <w:rPr>
+          <w:rFonts w:cs="Times New Roman"/>
+          <w:b/>
+          <w:color w:val="FF0000"/>
+        </w:rPr>
+        <w:t>backup</w:t>
+      </w:r>
+      <w:proofErr w:type="spellEnd"/>
       <w:r>
         <w:rPr>
           <w:rFonts w:cs="Times New Roman"/>
@@ -2180,9 +2207,11 @@
       <w:pPr>
         <w:pStyle w:val="Heading2"/>
       </w:pPr>
-      <w:bookmarkStart w:id="18" w:name="_(b)_Restoring_IDM"/>
-      <w:bookmarkStart w:id="19" w:name="_Toc338444611"/>
-      <w:bookmarkEnd w:id="18"/>
+      <w:bookmarkStart w:id="22" w:name="_(b)_Restoring_IDM"/>
+      <w:bookmarkStart w:id="23" w:name="_4.2_Restoring_IDM"/>
+      <w:bookmarkStart w:id="24" w:name="_Toc338444611"/>
+      <w:bookmarkEnd w:id="22"/>
+      <w:bookmarkEnd w:id="23"/>
       <w:r>
         <w:t>4.2</w:t>
       </w:r>
@@ -2192,7 +2221,7 @@
       <w:r>
         <w:t>Restoring IDM</w:t>
       </w:r>
-      <w:bookmarkEnd w:id="19"/>
+      <w:bookmarkEnd w:id="24"/>
     </w:p>
     <w:p>
       <w:pPr>
@@ -2221,9 +2250,9 @@
           <w:lang w:bidi="ar-SA"/>
         </w:rPr>
         <w:drawing>
-          <wp:inline distT="0" distB="0" distL="0" distR="0" wp14:anchorId="5FA91A49" wp14:editId="756240B4">
-            <wp:extent cx="4239217" cy="2896003"/>
-            <wp:effectExtent l="0" t="0" r="9525" b="0"/>
+          <wp:inline distT="0" distB="0" distL="0" distR="0" wp14:anchorId="397EB314" wp14:editId="4CA8CD39">
+            <wp:extent cx="4184160" cy="2896003"/>
+            <wp:effectExtent l="0" t="0" r="6985" b="0"/>
             <wp:docPr id="6" name="Picture 5"/>
             <wp:cNvGraphicFramePr>
               <a:graphicFrameLocks xmlns:a="http://schemas.openxmlformats.org/drawingml/2006/main" noChangeAspect="1"/>
@@ -2250,7 +2279,7 @@
                   <pic:spPr>
                     <a:xfrm>
                       <a:off x="0" y="0"/>
-                      <a:ext cx="4239217" cy="2896003"/>
+                      <a:ext cx="4184160" cy="2896003"/>
                     </a:xfrm>
                     <a:prstGeom prst="rect">
                       <a:avLst/>
@@ -2451,10 +2480,13 @@
       <w:pPr>
         <w:pStyle w:val="Heading2"/>
       </w:pPr>
-      <w:bookmarkStart w:id="20" w:name="_(c)_IDM_List"/>
-      <w:bookmarkStart w:id="21" w:name="_Toc338444612"/>
-      <w:bookmarkEnd w:id="20"/>
-      <w:r>
+      <w:bookmarkStart w:id="25" w:name="_(c)_IDM_List"/>
+      <w:bookmarkStart w:id="26" w:name="_4.3_IDM_List"/>
+      <w:bookmarkStart w:id="27" w:name="_Toc338444612"/>
+      <w:bookmarkEnd w:id="25"/>
+      <w:bookmarkEnd w:id="26"/>
+      <w:r>
+        <w:lastRenderedPageBreak/>
         <w:t>4.3</w:t>
       </w:r>
       <w:r>
@@ -2463,7 +2495,7 @@
       <w:r>
         <w:t>IDM List Manager</w:t>
       </w:r>
-      <w:bookmarkEnd w:id="21"/>
+      <w:bookmarkEnd w:id="27"/>
     </w:p>
     <w:p>
       <w:pPr>
@@ -2570,10 +2602,10 @@
           <w:lang w:bidi="ar-SA"/>
         </w:rPr>
         <w:drawing>
-          <wp:inline distT="0" distB="0" distL="0" distR="0" wp14:anchorId="55591F98" wp14:editId="571DDAC4">
-            <wp:extent cx="6287378" cy="3115110"/>
-            <wp:effectExtent l="0" t="0" r="0" b="9525"/>
-            <wp:docPr id="7" name="Picture 6" descr="IDM List Manager Main Screenshot" title="IDM List Manager"/>
+          <wp:inline distT="0" distB="0" distL="0" distR="0" wp14:anchorId="02D5DE13" wp14:editId="61B534A0">
+            <wp:extent cx="6287378" cy="2778143"/>
+            <wp:effectExtent l="0" t="0" r="0" b="3175"/>
+            <wp:docPr id="7" name="Picture 6"/>
             <wp:cNvGraphicFramePr>
               <a:graphicFrameLocks xmlns:a="http://schemas.openxmlformats.org/drawingml/2006/main" noChangeAspect="1"/>
             </wp:cNvGraphicFramePr>
@@ -2585,7 +2617,13 @@
                     <pic:cNvPicPr/>
                   </pic:nvPicPr>
                   <pic:blipFill>
-                    <a:blip r:embed="rId15"/>
+                    <a:blip r:embed="rId15">
+                      <a:extLst>
+                        <a:ext uri="{28A0092B-C50C-407E-A947-70E740481C1C}">
+                          <a14:useLocalDpi xmlns:a14="http://schemas.microsoft.com/office/drawing/2010/main" val="0"/>
+                        </a:ext>
+                      </a:extLst>
+                    </a:blip>
                     <a:stretch>
                       <a:fillRect/>
                     </a:stretch>
@@ -2593,7 +2631,7 @@
                   <pic:spPr>
                     <a:xfrm>
                       <a:off x="0" y="0"/>
-                      <a:ext cx="6287378" cy="3115110"/>
+                      <a:ext cx="6287378" cy="2778143"/>
                     </a:xfrm>
                     <a:prstGeom prst="rect">
                       <a:avLst/>
@@ -2614,9 +2652,11 @@
       <w:pPr>
         <w:pStyle w:val="Heading3"/>
       </w:pPr>
-      <w:bookmarkStart w:id="22" w:name="_(i)_Analyzing_the"/>
-      <w:bookmarkStart w:id="23" w:name="_Toc338444613"/>
-      <w:bookmarkEnd w:id="22"/>
+      <w:bookmarkStart w:id="28" w:name="_(i)_Analyzing_the"/>
+      <w:bookmarkStart w:id="29" w:name="_4.3.1_Analyzing_the"/>
+      <w:bookmarkStart w:id="30" w:name="_Toc338444613"/>
+      <w:bookmarkEnd w:id="28"/>
+      <w:bookmarkEnd w:id="29"/>
       <w:r>
         <w:t>4.3.1</w:t>
       </w:r>
@@ -2632,7 +2672,7 @@
       <w:r>
         <w:t xml:space="preserve"> File</w:t>
       </w:r>
-      <w:bookmarkEnd w:id="23"/>
+      <w:bookmarkEnd w:id="30"/>
     </w:p>
     <w:p>
       <w:pPr>
@@ -2967,9 +3007,11 @@
       <w:pPr>
         <w:pStyle w:val="Heading3"/>
       </w:pPr>
-      <w:bookmarkStart w:id="24" w:name="_(ii)_Joining_File"/>
-      <w:bookmarkStart w:id="25" w:name="_Toc338444614"/>
-      <w:bookmarkEnd w:id="24"/>
+      <w:bookmarkStart w:id="31" w:name="_(ii)_Joining_File"/>
+      <w:bookmarkStart w:id="32" w:name="_4.3.2_Joining_FILE"/>
+      <w:bookmarkStart w:id="33" w:name="_Toc338444614"/>
+      <w:bookmarkEnd w:id="31"/>
+      <w:bookmarkEnd w:id="32"/>
       <w:r>
         <w:t>4.3.2</w:t>
       </w:r>
@@ -2979,7 +3021,7 @@
       <w:r>
         <w:t xml:space="preserve">Joining </w:t>
       </w:r>
-      <w:bookmarkEnd w:id="25"/>
+      <w:bookmarkEnd w:id="33"/>
       <w:r>
         <w:t>FILE (</w:t>
       </w:r>
@@ -3120,17 +3162,19 @@
           <w:rFonts w:cs="Times New Roman"/>
         </w:rPr>
       </w:pPr>
+      <w:bookmarkStart w:id="34" w:name="_GoBack"/>
       <w:r>
         <w:rPr>
           <w:rFonts w:cs="Times New Roman"/>
           <w:noProof/>
           <w:lang w:bidi="ar-SA"/>
         </w:rPr>
+        <w:lastRenderedPageBreak/>
         <w:drawing>
-          <wp:inline distT="0" distB="0" distL="0" distR="0" wp14:anchorId="2F5E7529" wp14:editId="55C16535">
-            <wp:extent cx="4934639" cy="1552792"/>
-            <wp:effectExtent l="0" t="0" r="0" b="9525"/>
-            <wp:docPr id="8" name="Picture 7" descr="Force Join File" title="IDM List Manager"/>
+          <wp:inline distT="0" distB="0" distL="0" distR="0" wp14:anchorId="7FB0C107" wp14:editId="3AEA37C2">
+            <wp:extent cx="6665976" cy="1673352"/>
+            <wp:effectExtent l="0" t="0" r="1905" b="3175"/>
+            <wp:docPr id="8" name="Picture 7"/>
             <wp:cNvGraphicFramePr>
               <a:graphicFrameLocks xmlns:a="http://schemas.openxmlformats.org/drawingml/2006/main" noChangeAspect="1"/>
             </wp:cNvGraphicFramePr>
@@ -3142,7 +3186,13 @@
                     <pic:cNvPicPr/>
                   </pic:nvPicPr>
                   <pic:blipFill>
-                    <a:blip r:embed="rId16"/>
+                    <a:blip r:embed="rId16">
+                      <a:extLst>
+                        <a:ext uri="{28A0092B-C50C-407E-A947-70E740481C1C}">
+                          <a14:useLocalDpi xmlns:a14="http://schemas.microsoft.com/office/drawing/2010/main" val="0"/>
+                        </a:ext>
+                      </a:extLst>
+                    </a:blip>
                     <a:stretch>
                       <a:fillRect/>
                     </a:stretch>
@@ -3150,7 +3200,7 @@
                   <pic:spPr>
                     <a:xfrm>
                       <a:off x="0" y="0"/>
-                      <a:ext cx="4934639" cy="1552792"/>
+                      <a:ext cx="6665976" cy="1673352"/>
                     </a:xfrm>
                     <a:prstGeom prst="rect">
                       <a:avLst/>
@@ -3166,14 +3216,17 @@
           </wp:inline>
         </w:drawing>
       </w:r>
+      <w:bookmarkEnd w:id="34"/>
     </w:p>
     <w:p>
       <w:pPr>
         <w:pStyle w:val="Heading3"/>
       </w:pPr>
-      <w:bookmarkStart w:id="26" w:name="_(iii)_Removing_File"/>
-      <w:bookmarkStart w:id="27" w:name="_Toc338444615"/>
-      <w:bookmarkEnd w:id="26"/>
+      <w:bookmarkStart w:id="35" w:name="_(iii)_Removing_File"/>
+      <w:bookmarkStart w:id="36" w:name="_4.3.3_Removing_File"/>
+      <w:bookmarkStart w:id="37" w:name="_Toc338444615"/>
+      <w:bookmarkEnd w:id="35"/>
+      <w:bookmarkEnd w:id="36"/>
       <w:r>
         <w:t>4.3.3</w:t>
       </w:r>
@@ -3183,7 +3236,7 @@
       <w:r>
         <w:t>Removing File</w:t>
       </w:r>
-      <w:bookmarkEnd w:id="27"/>
+      <w:bookmarkEnd w:id="37"/>
     </w:p>
     <w:p>
       <w:pPr>
@@ -3228,9 +3281,11 @@
       <w:pPr>
         <w:pStyle w:val="Heading3"/>
       </w:pPr>
-      <w:bookmarkStart w:id="28" w:name="_(iv)_Exporting_List"/>
-      <w:bookmarkStart w:id="29" w:name="_Toc338444616"/>
-      <w:bookmarkEnd w:id="28"/>
+      <w:bookmarkStart w:id="38" w:name="_(iv)_Exporting_List"/>
+      <w:bookmarkStart w:id="39" w:name="_4.3.4_Exporting_List"/>
+      <w:bookmarkStart w:id="40" w:name="_Toc338444616"/>
+      <w:bookmarkEnd w:id="38"/>
+      <w:bookmarkEnd w:id="39"/>
       <w:r>
         <w:t>4.3.4</w:t>
       </w:r>
@@ -3240,7 +3295,7 @@
       <w:r>
         <w:t xml:space="preserve"> List</w:t>
       </w:r>
-      <w:bookmarkEnd w:id="29"/>
+      <w:bookmarkEnd w:id="40"/>
     </w:p>
     <w:p>
       <w:pPr>
@@ -3299,10 +3354,10 @@
           <w:lang w:bidi="ar-SA"/>
         </w:rPr>
         <w:drawing>
-          <wp:inline distT="0" distB="0" distL="0" distR="0" wp14:anchorId="77548EBF" wp14:editId="01F53631">
-            <wp:extent cx="3943901" cy="1247949"/>
-            <wp:effectExtent l="0" t="0" r="0" b="9525"/>
-            <wp:docPr id="9" name="Picture 8" descr="Export List in Various Format" title="IDM List Manager"/>
+          <wp:inline distT="0" distB="0" distL="0" distR="0" wp14:anchorId="4669DE06" wp14:editId="66777022">
+            <wp:extent cx="3943901" cy="1107244"/>
+            <wp:effectExtent l="0" t="0" r="0" b="0"/>
+            <wp:docPr id="9" name="Picture 8"/>
             <wp:cNvGraphicFramePr>
               <a:graphicFrameLocks xmlns:a="http://schemas.openxmlformats.org/drawingml/2006/main" noChangeAspect="1"/>
             </wp:cNvGraphicFramePr>
@@ -3314,7 +3369,13 @@
                     <pic:cNvPicPr/>
                   </pic:nvPicPr>
                   <pic:blipFill>
-                    <a:blip r:embed="rId17"/>
+                    <a:blip r:embed="rId17">
+                      <a:extLst>
+                        <a:ext uri="{28A0092B-C50C-407E-A947-70E740481C1C}">
+                          <a14:useLocalDpi xmlns:a14="http://schemas.microsoft.com/office/drawing/2010/main" val="0"/>
+                        </a:ext>
+                      </a:extLst>
+                    </a:blip>
                     <a:stretch>
                       <a:fillRect/>
                     </a:stretch>
@@ -3322,7 +3383,7 @@
                   <pic:spPr>
                     <a:xfrm>
                       <a:off x="0" y="0"/>
-                      <a:ext cx="3943901" cy="1247949"/>
+                      <a:ext cx="3943901" cy="1107244"/>
                     </a:xfrm>
                     <a:prstGeom prst="rect">
                       <a:avLst/>
@@ -3429,9 +3490,11 @@
       <w:pPr>
         <w:pStyle w:val="Heading2"/>
       </w:pPr>
-      <w:bookmarkStart w:id="30" w:name="_(d)_IDM_Cleaner"/>
-      <w:bookmarkStart w:id="31" w:name="_Toc338444617"/>
-      <w:bookmarkEnd w:id="30"/>
+      <w:bookmarkStart w:id="41" w:name="_(d)_IDM_Cleaner"/>
+      <w:bookmarkStart w:id="42" w:name="_4.4_IDM_Cleaner"/>
+      <w:bookmarkStart w:id="43" w:name="_Toc338444617"/>
+      <w:bookmarkEnd w:id="41"/>
+      <w:bookmarkEnd w:id="42"/>
       <w:r>
         <w:t>4.4</w:t>
       </w:r>
@@ -3441,7 +3504,7 @@
       <w:r>
         <w:t>IDM Cleaner</w:t>
       </w:r>
-      <w:bookmarkEnd w:id="31"/>
+      <w:bookmarkEnd w:id="43"/>
     </w:p>
     <w:p>
       <w:pPr>
@@ -3477,11 +3540,12 @@
           <w:noProof/>
           <w:lang w:bidi="ar-SA"/>
         </w:rPr>
+        <w:lastRenderedPageBreak/>
         <w:drawing>
-          <wp:inline distT="0" distB="0" distL="0" distR="0" wp14:anchorId="372CB292" wp14:editId="48CB4A6E">
-            <wp:extent cx="1981477" cy="2734057"/>
-            <wp:effectExtent l="0" t="0" r="0" b="9525"/>
-            <wp:docPr id="10" name="Picture 9" descr="Clean IDM Data" title="IDM Cleaner"/>
+          <wp:inline distT="0" distB="0" distL="0" distR="0" wp14:anchorId="0F15AE08" wp14:editId="4DC22F0A">
+            <wp:extent cx="1981477" cy="2695951"/>
+            <wp:effectExtent l="0" t="0" r="0" b="0"/>
+            <wp:docPr id="10" name="Picture 9"/>
             <wp:cNvGraphicFramePr>
               <a:graphicFrameLocks xmlns:a="http://schemas.openxmlformats.org/drawingml/2006/main" noChangeAspect="1"/>
             </wp:cNvGraphicFramePr>
@@ -3493,7 +3557,13 @@
                     <pic:cNvPicPr/>
                   </pic:nvPicPr>
                   <pic:blipFill>
-                    <a:blip r:embed="rId18"/>
+                    <a:blip r:embed="rId18">
+                      <a:extLst>
+                        <a:ext uri="{28A0092B-C50C-407E-A947-70E740481C1C}">
+                          <a14:useLocalDpi xmlns:a14="http://schemas.microsoft.com/office/drawing/2010/main" val="0"/>
+                        </a:ext>
+                      </a:extLst>
+                    </a:blip>
                     <a:stretch>
                       <a:fillRect/>
                     </a:stretch>
@@ -3501,7 +3571,7 @@
                   <pic:spPr>
                     <a:xfrm>
                       <a:off x="0" y="0"/>
-                      <a:ext cx="1981477" cy="2734057"/>
+                      <a:ext cx="1981477" cy="2695951"/>
                     </a:xfrm>
                     <a:prstGeom prst="rect">
                       <a:avLst/>
@@ -3535,9 +3605,11 @@
       <w:pPr>
         <w:pStyle w:val="Heading3"/>
       </w:pPr>
-      <w:bookmarkStart w:id="32" w:name="_(i)_Custom_Clean"/>
-      <w:bookmarkStart w:id="33" w:name="_Toc338444618"/>
-      <w:bookmarkEnd w:id="32"/>
+      <w:bookmarkStart w:id="44" w:name="_(i)_Custom_Clean"/>
+      <w:bookmarkStart w:id="45" w:name="_4.4.1_Custom_Clean"/>
+      <w:bookmarkStart w:id="46" w:name="_Toc338444618"/>
+      <w:bookmarkEnd w:id="44"/>
+      <w:bookmarkEnd w:id="45"/>
       <w:r>
         <w:t>4.4.1</w:t>
       </w:r>
@@ -3547,7 +3619,7 @@
       <w:r>
         <w:t>Custom Clean</w:t>
       </w:r>
-      <w:bookmarkEnd w:id="33"/>
+      <w:bookmarkEnd w:id="46"/>
     </w:p>
     <w:p>
       <w:pPr>
@@ -3574,9 +3646,11 @@
       <w:pPr>
         <w:pStyle w:val="Heading3"/>
       </w:pPr>
-      <w:bookmarkStart w:id="34" w:name="_(ii)_Full_Clean"/>
-      <w:bookmarkStart w:id="35" w:name="_Toc338444619"/>
-      <w:bookmarkEnd w:id="34"/>
+      <w:bookmarkStart w:id="47" w:name="_(ii)_Full_Clean"/>
+      <w:bookmarkStart w:id="48" w:name="_4.4.2_Full_Clean"/>
+      <w:bookmarkStart w:id="49" w:name="_Toc338444619"/>
+      <w:bookmarkEnd w:id="47"/>
+      <w:bookmarkEnd w:id="48"/>
       <w:r>
         <w:t>4.4.2</w:t>
       </w:r>
@@ -3586,7 +3660,7 @@
       <w:r>
         <w:t>Full Clean</w:t>
       </w:r>
-      <w:bookmarkEnd w:id="35"/>
+      <w:bookmarkEnd w:id="49"/>
     </w:p>
     <w:p>
       <w:pPr>
@@ -3629,43 +3703,59 @@
     </w:p>
     <w:p>
       <w:pPr>
-        <w:pStyle w:val="Heading1"/>
-      </w:pPr>
-      <w:bookmarkStart w:id="36" w:name="_5._SETTING"/>
-      <w:bookmarkEnd w:id="36"/>
-      <w:r>
-        <w:t>5. SETTING</w:t>
-      </w:r>
-    </w:p>
-    <w:p>
-      <w:pPr>
-        <w:rPr>
-          <w:rFonts w:cs="Times New Roman"/>
-        </w:rPr>
-      </w:pPr>
-      <w:r>
-        <w:rPr>
-          <w:rFonts w:cs="Times New Roman"/>
-        </w:rPr>
-        <w:t xml:space="preserve">Setting tab allow to change IDM Default profile while backing up/Restoring IDM. </w:t>
-      </w:r>
-      <w:r>
-        <w:rPr>
-          <w:rFonts w:cs="Times New Roman"/>
-        </w:rPr>
-        <w:t>In addition,</w:t>
-      </w:r>
-      <w:r>
-        <w:rPr>
-          <w:rFonts w:cs="Times New Roman"/>
-        </w:rPr>
-        <w:t xml:space="preserve"> you can change Log File path and Backup </w:t>
-      </w:r>
-      <w:r>
-        <w:rPr>
-          <w:rFonts w:cs="Times New Roman"/>
-        </w:rPr>
-        <w:t>Folder. Below Screenshot is shown:</w:t>
+        <w:pStyle w:val="Heading2"/>
+      </w:pPr>
+      <w:bookmarkStart w:id="50" w:name="_4.5_PASSWORD_CLEANER"/>
+      <w:bookmarkEnd w:id="50"/>
+      <w:r>
+        <w:t>4.5 PASSWORD CLEANER</w:t>
+      </w:r>
+    </w:p>
+    <w:p>
+      <w:pPr>
+        <w:rPr>
+          <w:rFonts w:cs="Times New Roman"/>
+        </w:rPr>
+      </w:pPr>
+      <w:r>
+        <w:rPr>
+          <w:rFonts w:cs="Times New Roman"/>
+        </w:rPr>
+        <w:t xml:space="preserve">Go to Tools Menu and run </w:t>
+      </w:r>
+      <w:r>
+        <w:rPr>
+          <w:rFonts w:cs="Times New Roman"/>
+        </w:rPr>
+        <w:t>Password</w:t>
+      </w:r>
+      <w:r>
+        <w:rPr>
+          <w:rFonts w:cs="Times New Roman"/>
+        </w:rPr>
+        <w:t xml:space="preserve"> Cleaner.</w:t>
+      </w:r>
+      <w:r>
+        <w:rPr>
+          <w:rFonts w:cs="Times New Roman"/>
+        </w:rPr>
+        <w:t xml:space="preserve"> Password cleaner remove all Sites Logins password from IDM.</w:t>
+      </w:r>
+      <w:r>
+        <w:rPr>
+          <w:rFonts w:cs="Times New Roman"/>
+          <w:b/>
+          <w:color w:val="FF0000"/>
+        </w:rPr>
+        <w:t xml:space="preserve"> </w:t>
+      </w:r>
+      <w:r>
+        <w:rPr>
+          <w:rFonts w:cs="Times New Roman"/>
+          <w:b/>
+          <w:color w:val="FF0000"/>
+        </w:rPr>
+        <w:t>Be Careful!</w:t>
       </w:r>
     </w:p>
     <w:p>
@@ -3682,10 +3772,10 @@
           <w:lang w:bidi="ar-SA"/>
         </w:rPr>
         <w:drawing>
-          <wp:inline distT="0" distB="0" distL="0" distR="0">
-            <wp:extent cx="4239217" cy="2896003"/>
-            <wp:effectExtent l="0" t="0" r="9525" b="0"/>
-            <wp:docPr id="15" name="Picture 15"/>
+          <wp:inline distT="0" distB="0" distL="0" distR="0" wp14:anchorId="2D936D13" wp14:editId="0BCC2E99">
+            <wp:extent cx="1755648" cy="804672"/>
+            <wp:effectExtent l="0" t="0" r="0" b="0"/>
+            <wp:docPr id="22" name="Picture 22"/>
             <wp:cNvGraphicFramePr>
               <a:graphicFrameLocks xmlns:a="http://schemas.openxmlformats.org/drawingml/2006/main" noChangeAspect="1"/>
             </wp:cNvGraphicFramePr>
@@ -3693,7 +3783,7 @@
               <a:graphicData uri="http://schemas.openxmlformats.org/drawingml/2006/picture">
                 <pic:pic xmlns:pic="http://schemas.openxmlformats.org/drawingml/2006/picture">
                   <pic:nvPicPr>
-                    <pic:cNvPr id="0" name="5.0.png"/>
+                    <pic:cNvPr id="0" name="Pw Cleaner.png"/>
                     <pic:cNvPicPr/>
                   </pic:nvPicPr>
                   <pic:blipFill>
@@ -3711,7 +3801,7 @@
                   <pic:spPr>
                     <a:xfrm>
                       <a:off x="0" y="0"/>
-                      <a:ext cx="4239217" cy="2896003"/>
+                      <a:ext cx="1755648" cy="804672"/>
                     </a:xfrm>
                     <a:prstGeom prst="rect">
                       <a:avLst/>
@@ -3726,456 +3816,63 @@
     </w:p>
     <w:p>
       <w:pPr>
-        <w:pStyle w:val="ListParagraph"/>
-        <w:numPr>
-          <w:ilvl w:val="0"/>
-          <w:numId w:val="20"/>
-        </w:numPr>
-        <w:rPr>
-          <w:rFonts w:cs="Times New Roman"/>
-          <w:b/>
-          <w:bCs/>
-        </w:rPr>
-      </w:pPr>
-      <w:r>
-        <w:rPr>
-          <w:rFonts w:cs="Times New Roman"/>
-          <w:b/>
-          <w:bCs/>
-        </w:rPr>
-        <w:t>Default Application Path</w:t>
-      </w:r>
-    </w:p>
-    <w:p>
-      <w:pPr>
-        <w:pStyle w:val="ListParagraph"/>
-        <w:numPr>
-          <w:ilvl w:val="1"/>
-          <w:numId w:val="20"/>
-        </w:numPr>
-        <w:rPr>
-          <w:rFonts w:cs="Times New Roman"/>
-          <w:b/>
-          <w:bCs/>
-        </w:rPr>
-      </w:pPr>
-      <w:r>
-        <w:rPr>
-          <w:rFonts w:cs="Times New Roman"/>
-          <w:b/>
-          <w:bCs/>
-        </w:rPr>
-        <w:t>Log File Path:</w:t>
-      </w:r>
-      <w:r>
-        <w:rPr>
-          <w:rFonts w:cs="Times New Roman"/>
-        </w:rPr>
-        <w:t xml:space="preserve"> Where you </w:t>
-      </w:r>
-      <w:r>
-        <w:rPr>
-          <w:rFonts w:cs="Times New Roman"/>
-        </w:rPr>
-        <w:t>can</w:t>
-      </w:r>
-      <w:r>
-        <w:rPr>
-          <w:rFonts w:cs="Times New Roman"/>
-        </w:rPr>
-        <w:t xml:space="preserve"> save log file.</w:t>
-      </w:r>
-      <w:r>
-        <w:rPr>
-          <w:rFonts w:cs="Times New Roman"/>
-        </w:rPr>
-        <w:t xml:space="preserve"> Default Path is </w:t>
-      </w:r>
-      <w:r>
-        <w:rPr>
-          <w:rFonts w:cs="Times New Roman"/>
-          <w:b/>
-          <w:bCs/>
-        </w:rPr>
-        <w:t>@</w:t>
-      </w:r>
-      <w:r>
-        <w:rPr>
-          <w:rFonts w:cs="Times New Roman"/>
-          <w:b/>
-          <w:bCs/>
-        </w:rPr>
-        <w:t>User</w:t>
-      </w:r>
-      <w:r>
-        <w:rPr>
-          <w:rFonts w:cs="Times New Roman"/>
-          <w:b/>
-          <w:bCs/>
-        </w:rPr>
-        <w:t xml:space="preserve"> Profile</w:t>
-      </w:r>
-      <w:r>
-        <w:rPr>
-          <w:rFonts w:cs="Times New Roman"/>
-          <w:b/>
-          <w:bCs/>
-        </w:rPr>
-        <w:t>\AppData\Roaming\IDM Backup Manager</w:t>
-      </w:r>
-      <w:r>
-        <w:rPr>
-          <w:rFonts w:cs="Times New Roman"/>
-          <w:b/>
-          <w:bCs/>
-        </w:rPr>
-        <w:t>\</w:t>
-      </w:r>
-      <w:r>
-        <w:rPr>
-          <w:rFonts w:cs="Times New Roman"/>
-          <w:b/>
-          <w:bCs/>
-        </w:rPr>
-        <w:t>LogFile.log</w:t>
-      </w:r>
-    </w:p>
-    <w:p>
-      <w:pPr>
-        <w:pStyle w:val="ListParagraph"/>
-        <w:numPr>
-          <w:ilvl w:val="1"/>
-          <w:numId w:val="20"/>
-        </w:numPr>
-        <w:rPr>
-          <w:rFonts w:cs="Times New Roman"/>
-          <w:b/>
-          <w:bCs/>
-        </w:rPr>
-      </w:pPr>
-      <w:r>
-        <w:rPr>
-          <w:rFonts w:cs="Times New Roman"/>
-          <w:b/>
-          <w:bCs/>
-        </w:rPr>
-        <w:t>Backup Folder:</w:t>
-      </w:r>
-      <w:r>
-        <w:rPr>
-          <w:rFonts w:cs="Times New Roman"/>
-        </w:rPr>
-        <w:t xml:space="preserve"> Where backup File saved by default Path is </w:t>
-      </w:r>
-      <w:r>
-        <w:rPr>
-          <w:rFonts w:cs="Times New Roman"/>
-          <w:b/>
-          <w:bCs/>
-        </w:rPr>
-        <w:t>@</w:t>
-      </w:r>
-      <w:r>
-        <w:rPr>
-          <w:rFonts w:cs="Times New Roman"/>
-          <w:b/>
-          <w:bCs/>
-        </w:rPr>
-        <w:t>User</w:t>
-      </w:r>
-      <w:r>
-        <w:rPr>
-          <w:rFonts w:cs="Times New Roman"/>
-          <w:b/>
-          <w:bCs/>
-        </w:rPr>
-        <w:t xml:space="preserve"> Profile </w:t>
-      </w:r>
-      <w:r>
-        <w:rPr>
-          <w:rFonts w:cs="Times New Roman"/>
-          <w:b/>
-          <w:bCs/>
-        </w:rPr>
-        <w:t>\Documents\IDM Backup Files</w:t>
-      </w:r>
-      <w:r>
-        <w:rPr>
-          <w:rFonts w:cs="Times New Roman"/>
-          <w:b/>
-          <w:bCs/>
-        </w:rPr>
-        <w:t>\</w:t>
-      </w:r>
-    </w:p>
-    <w:p>
-      <w:pPr>
-        <w:pStyle w:val="ListParagraph"/>
-        <w:numPr>
-          <w:ilvl w:val="1"/>
-          <w:numId w:val="20"/>
-        </w:numPr>
-        <w:rPr>
-          <w:rFonts w:cs="Times New Roman"/>
-          <w:b/>
-          <w:bCs/>
-        </w:rPr>
-      </w:pPr>
-      <w:r>
-        <w:rPr>
-          <w:rFonts w:cs="Times New Roman"/>
-          <w:b/>
-          <w:bCs/>
-        </w:rPr>
-        <w:t>Setting (</w:t>
-      </w:r>
-      <w:proofErr w:type="spellStart"/>
-      <w:r>
-        <w:rPr>
-          <w:rFonts w:cs="Times New Roman"/>
-          <w:b/>
-          <w:bCs/>
-        </w:rPr>
-        <w:t>ini</w:t>
-      </w:r>
-      <w:proofErr w:type="spellEnd"/>
-      <w:r>
-        <w:rPr>
-          <w:rFonts w:cs="Times New Roman"/>
-          <w:b/>
-          <w:bCs/>
-        </w:rPr>
-        <w:t>) File:</w:t>
-      </w:r>
-      <w:r>
-        <w:rPr>
-          <w:rFonts w:cs="Times New Roman"/>
-        </w:rPr>
-        <w:t xml:space="preserve"> Default Path</w:t>
-      </w:r>
-      <w:r>
-        <w:rPr>
-          <w:rFonts w:cs="Times New Roman"/>
-        </w:rPr>
-        <w:t>(it cannot changed)</w:t>
-      </w:r>
-      <w:r>
-        <w:rPr>
-          <w:rFonts w:cs="Times New Roman"/>
-        </w:rPr>
-        <w:t xml:space="preserve"> is </w:t>
-      </w:r>
-      <w:r>
-        <w:rPr>
-          <w:rFonts w:cs="Times New Roman"/>
-          <w:b/>
-          <w:bCs/>
-        </w:rPr>
-        <w:t>@User</w:t>
-      </w:r>
-      <w:r>
-        <w:rPr>
-          <w:rFonts w:cs="Times New Roman"/>
-          <w:b/>
-          <w:bCs/>
-        </w:rPr>
-        <w:t xml:space="preserve"> Profile </w:t>
-      </w:r>
-      <w:r>
-        <w:rPr>
-          <w:rFonts w:cs="Times New Roman"/>
-          <w:b/>
-          <w:bCs/>
-        </w:rPr>
-        <w:t>\AppData\Roaming\IDM Backup Manager\SettingFile.ini</w:t>
-      </w:r>
-    </w:p>
-    <w:p>
-      <w:pPr>
-        <w:pStyle w:val="ListParagraph"/>
-        <w:numPr>
-          <w:ilvl w:val="0"/>
-          <w:numId w:val="20"/>
-        </w:numPr>
-        <w:rPr>
-          <w:rFonts w:cs="Times New Roman"/>
-          <w:b/>
-          <w:bCs/>
-        </w:rPr>
-      </w:pPr>
-      <w:r>
-        <w:rPr>
-          <w:rFonts w:cs="Times New Roman"/>
-          <w:b/>
-          <w:bCs/>
-        </w:rPr>
-        <w:t>Default Profile</w:t>
-      </w:r>
-    </w:p>
-    <w:p>
-      <w:pPr>
-        <w:pStyle w:val="ListParagraph"/>
-        <w:numPr>
-          <w:ilvl w:val="1"/>
-          <w:numId w:val="20"/>
-        </w:numPr>
-        <w:rPr>
-          <w:rFonts w:cs="Times New Roman"/>
-          <w:b/>
-          <w:bCs/>
-        </w:rPr>
-      </w:pPr>
-      <w:r>
-        <w:rPr>
-          <w:rFonts w:cs="Times New Roman"/>
-          <w:b/>
-          <w:bCs/>
-        </w:rPr>
-        <w:t>AppData Folder:</w:t>
-      </w:r>
-      <w:r>
-        <w:rPr>
-          <w:rFonts w:cs="Times New Roman"/>
-        </w:rPr>
-        <w:t xml:space="preserve"> IDM Default Profile Folder. Default Path is </w:t>
-      </w:r>
-      <w:r>
-        <w:rPr>
-          <w:rFonts w:cs="Times New Roman"/>
-          <w:b/>
-          <w:bCs/>
-        </w:rPr>
-        <w:t>@User Profile\AppData\Roaming\IDM\</w:t>
-      </w:r>
-    </w:p>
-    <w:p>
-      <w:pPr>
-        <w:pStyle w:val="ListParagraph"/>
-        <w:numPr>
-          <w:ilvl w:val="1"/>
-          <w:numId w:val="20"/>
-        </w:numPr>
-        <w:rPr>
-          <w:rFonts w:cs="Times New Roman"/>
-        </w:rPr>
-      </w:pPr>
-      <w:r>
-        <w:rPr>
-          <w:rFonts w:cs="Times New Roman"/>
-          <w:b/>
-          <w:bCs/>
-        </w:rPr>
-        <w:t xml:space="preserve">DonlData Folder: </w:t>
-      </w:r>
-      <w:r>
-        <w:rPr>
-          <w:rFonts w:cs="Times New Roman"/>
-        </w:rPr>
-        <w:t>Where Unfinishe</w:t>
-      </w:r>
-      <w:bookmarkStart w:id="37" w:name="_GoBack"/>
-      <w:bookmarkEnd w:id="37"/>
-      <w:r>
-        <w:rPr>
-          <w:rFonts w:cs="Times New Roman"/>
-        </w:rPr>
-        <w:t xml:space="preserve">d Downloads data saved. By default path is </w:t>
-      </w:r>
-      <w:r>
-        <w:rPr>
-          <w:rFonts w:cs="Times New Roman"/>
-          <w:b/>
-          <w:bCs/>
-        </w:rPr>
-        <w:t>@User Profile\</w:t>
-      </w:r>
-      <w:proofErr w:type="spellStart"/>
-      <w:r>
-        <w:rPr>
-          <w:rFonts w:cs="Times New Roman"/>
-          <w:b/>
-          <w:bCs/>
-        </w:rPr>
-        <w:t>AppData</w:t>
-      </w:r>
-      <w:proofErr w:type="spellEnd"/>
-      <w:r>
-        <w:rPr>
-          <w:rFonts w:cs="Times New Roman"/>
-          <w:b/>
-          <w:bCs/>
-        </w:rPr>
-        <w:t>\Roaming\IDM\</w:t>
-      </w:r>
-      <w:proofErr w:type="spellStart"/>
-      <w:r>
-        <w:rPr>
-          <w:rFonts w:cs="Times New Roman"/>
-          <w:b/>
-          <w:bCs/>
-        </w:rPr>
-        <w:t>DwnlData</w:t>
-      </w:r>
-      <w:proofErr w:type="spellEnd"/>
-      <w:r>
-        <w:rPr>
-          <w:rFonts w:cs="Times New Roman"/>
-          <w:b/>
-          <w:bCs/>
-        </w:rPr>
-        <w:t>\</w:t>
-      </w:r>
-    </w:p>
-    <w:p>
-      <w:pPr>
-        <w:pStyle w:val="ListParagraph"/>
-        <w:numPr>
-          <w:ilvl w:val="0"/>
-          <w:numId w:val="20"/>
-        </w:numPr>
-        <w:rPr>
-          <w:rFonts w:cs="Times New Roman"/>
-          <w:b/>
-          <w:bCs/>
-        </w:rPr>
-      </w:pPr>
-      <w:r>
-        <w:rPr>
-          <w:rFonts w:cs="Times New Roman"/>
-          <w:b/>
-          <w:bCs/>
-        </w:rPr>
-        <w:t>More Setting</w:t>
-      </w:r>
-    </w:p>
-    <w:p>
-      <w:pPr>
-        <w:pStyle w:val="ListParagraph"/>
-        <w:numPr>
-          <w:ilvl w:val="1"/>
-          <w:numId w:val="20"/>
-        </w:numPr>
-        <w:rPr>
-          <w:rFonts w:cs="Times New Roman"/>
-        </w:rPr>
-      </w:pPr>
-      <w:r>
-        <w:rPr>
-          <w:rFonts w:cs="Times New Roman"/>
-        </w:rPr>
-        <w:t xml:space="preserve">Click on </w:t>
-      </w:r>
-      <w:r>
-        <w:rPr>
-          <w:rFonts w:cs="Times New Roman"/>
+        <w:pStyle w:val="Heading2"/>
+      </w:pPr>
+      <w:bookmarkStart w:id="51" w:name="_4.6_Add_Extra"/>
+      <w:bookmarkEnd w:id="51"/>
+      <w:r>
+        <w:t xml:space="preserve">4.6 </w:t>
+      </w:r>
+      <w:r>
+        <w:t>Add Extra Files Types</w:t>
+      </w:r>
+    </w:p>
+    <w:p>
+      <w:pPr>
+        <w:rPr>
+          <w:rFonts w:cs="Times New Roman"/>
+        </w:rPr>
+      </w:pPr>
+      <w:r>
+        <w:rPr>
+          <w:rFonts w:cs="Times New Roman"/>
+        </w:rPr>
+        <w:t xml:space="preserve">Go to Tools Menu and run </w:t>
+      </w:r>
+      <w:r>
+        <w:rPr>
+          <w:rFonts w:cs="Times New Roman"/>
+        </w:rPr>
+        <w:t>Add Extra Files Types in Categories</w:t>
+      </w:r>
+      <w:r>
+        <w:rPr>
+          <w:rFonts w:cs="Times New Roman"/>
+        </w:rPr>
+        <w:t>.</w:t>
+      </w:r>
+      <w:r>
+        <w:rPr>
+          <w:rFonts w:cs="Times New Roman"/>
+        </w:rPr>
+        <w:t xml:space="preserve"> This will automatically add extra defined files types to IDM Categories.</w:t>
+      </w:r>
+    </w:p>
+    <w:p>
+      <w:pPr>
+        <w:jc w:val="center"/>
+      </w:pPr>
+      <w:r>
+        <w:rPr>
           <w:noProof/>
           <w:lang w:bidi="ar-SA"/>
         </w:rPr>
+        <w:lastRenderedPageBreak/>
         <w:drawing>
-          <wp:inline distT="0" distB="0" distL="0" distR="0" wp14:anchorId="1A5A592F" wp14:editId="171C1EF1">
-            <wp:extent cx="285790" cy="219106"/>
-            <wp:effectExtent l="0" t="0" r="0" b="9525"/>
-            <wp:docPr id="14" name="Picture 14"/>
+          <wp:inline distT="0" distB="0" distL="0" distR="0" wp14:anchorId="33245C01" wp14:editId="14EA6397">
+            <wp:extent cx="4599054" cy="2304288"/>
+            <wp:effectExtent l="0" t="0" r="0" b="1270"/>
+            <wp:docPr id="23" name="Picture 23"/>
             <wp:cNvGraphicFramePr>
               <a:graphicFrameLocks xmlns:a="http://schemas.openxmlformats.org/drawingml/2006/main" noChangeAspect="1"/>
             </wp:cNvGraphicFramePr>
@@ -4183,7 +3880,7 @@
               <a:graphicData uri="http://schemas.openxmlformats.org/drawingml/2006/picture">
                 <pic:pic xmlns:pic="http://schemas.openxmlformats.org/drawingml/2006/picture">
                   <pic:nvPicPr>
-                    <pic:cNvPr id="0" name="5.3.a.png"/>
+                    <pic:cNvPr id="0" name="File type enhance.png"/>
                     <pic:cNvPicPr/>
                   </pic:nvPicPr>
                   <pic:blipFill>
@@ -4201,7 +3898,7 @@
                   <pic:spPr>
                     <a:xfrm>
                       <a:off x="0" y="0"/>
-                      <a:ext cx="285790" cy="219106"/>
+                      <a:ext cx="4599054" cy="2304288"/>
                     </a:xfrm>
                     <a:prstGeom prst="rect">
                       <a:avLst/>
@@ -4213,110 +3910,55 @@
           </wp:inline>
         </w:drawing>
       </w:r>
-      <w:r>
-        <w:rPr>
-          <w:rFonts w:cs="Times New Roman"/>
-        </w:rPr>
-        <w:t xml:space="preserve"> Setting </w:t>
-      </w:r>
-      <w:r>
-        <w:rPr>
-          <w:rFonts w:cs="Times New Roman"/>
-        </w:rPr>
-        <w:t>icon to change Some more setting:</w:t>
-      </w:r>
-    </w:p>
-    <w:p>
-      <w:pPr>
-        <w:pStyle w:val="ListParagraph"/>
-        <w:numPr>
-          <w:ilvl w:val="2"/>
-          <w:numId w:val="20"/>
-        </w:numPr>
-        <w:rPr>
-          <w:rFonts w:cs="Times New Roman"/>
-        </w:rPr>
-      </w:pPr>
-      <w:r>
-        <w:rPr>
-          <w:rFonts w:cs="Times New Roman"/>
-        </w:rPr>
-        <w:t xml:space="preserve">Log File will append on every Session </w:t>
-      </w:r>
-      <w:r>
-        <w:rPr>
-          <w:rFonts w:cs="Times New Roman"/>
-        </w:rPr>
-        <w:t xml:space="preserve">or </w:t>
-      </w:r>
-      <w:proofErr w:type="gramStart"/>
-      <w:r>
-        <w:rPr>
-          <w:rFonts w:cs="Times New Roman"/>
-        </w:rPr>
-        <w:t>Not</w:t>
-      </w:r>
-      <w:r>
-        <w:rPr>
-          <w:rFonts w:cs="Times New Roman"/>
-        </w:rPr>
-        <w:t>(</w:t>
-      </w:r>
-      <w:proofErr w:type="gramEnd"/>
-      <w:r>
-        <w:rPr>
-          <w:rFonts w:cs="Times New Roman"/>
-        </w:rPr>
-        <w:t>On startup).</w:t>
-      </w:r>
-    </w:p>
-    <w:p>
-      <w:pPr>
-        <w:pStyle w:val="ListParagraph"/>
-        <w:numPr>
-          <w:ilvl w:val="2"/>
-          <w:numId w:val="20"/>
-        </w:numPr>
-        <w:rPr>
-          <w:rFonts w:cs="Times New Roman"/>
-        </w:rPr>
-      </w:pPr>
-      <w:r>
-        <w:rPr>
-          <w:rFonts w:cs="Times New Roman"/>
-        </w:rPr>
-        <w:t>Restart IDM every time on restore</w:t>
-      </w:r>
-      <w:r>
-        <w:rPr>
-          <w:rFonts w:cs="Times New Roman"/>
-        </w:rPr>
-        <w:t xml:space="preserve"> or Not</w:t>
-      </w:r>
-      <w:r>
-        <w:rPr>
-          <w:rFonts w:cs="Times New Roman"/>
-        </w:rPr>
-        <w:t>.</w:t>
-      </w:r>
-    </w:p>
-    <w:p>
-      <w:pPr>
-        <w:pStyle w:val="ListParagraph"/>
-        <w:numPr>
-          <w:ilvl w:val="1"/>
-          <w:numId w:val="20"/>
-        </w:numPr>
-        <w:rPr>
-          <w:rFonts w:cs="Times New Roman"/>
-        </w:rPr>
-      </w:pPr>
-      <w:r>
-        <w:rPr>
-          <w:rFonts w:cs="Times New Roman"/>
-        </w:rPr>
-        <w:t xml:space="preserve">Click on </w:t>
-      </w:r>
+    </w:p>
+    <w:p>
+      <w:pPr>
+        <w:pStyle w:val="Heading1"/>
+      </w:pPr>
+      <w:bookmarkStart w:id="52" w:name="_5._SETTING"/>
+      <w:bookmarkEnd w:id="52"/>
+      <w:r>
+        <w:t>5. SETTING</w:t>
+      </w:r>
+    </w:p>
+    <w:p>
+      <w:pPr>
+        <w:rPr>
+          <w:rFonts w:cs="Times New Roman"/>
+        </w:rPr>
+      </w:pPr>
+      <w:r>
+        <w:rPr>
+          <w:rFonts w:cs="Times New Roman"/>
+        </w:rPr>
+        <w:t xml:space="preserve">Setting tab allow to change IDM Default profile while backing up/Restoring IDM. </w:t>
+      </w:r>
+      <w:r>
+        <w:rPr>
+          <w:rFonts w:cs="Times New Roman"/>
+        </w:rPr>
+        <w:t>In addition,</w:t>
+      </w:r>
+      <w:r>
+        <w:rPr>
+          <w:rFonts w:cs="Times New Roman"/>
+        </w:rPr>
+        <w:t xml:space="preserve"> you can change Log File path and Backup </w:t>
+      </w:r>
+      <w:r>
+        <w:rPr>
+          <w:rFonts w:cs="Times New Roman"/>
+        </w:rPr>
+        <w:t>Folder. Below Screenshot is shown:</w:t>
+      </w:r>
+    </w:p>
+    <w:p>
+      <w:pPr>
+        <w:jc w:val="center"/>
+        <w:rPr>
+          <w:rFonts w:cs="Times New Roman"/>
+        </w:rPr>
+      </w:pPr>
       <w:r>
         <w:rPr>
           <w:rFonts w:cs="Times New Roman"/>
@@ -4324,10 +3966,10 @@
           <w:lang w:bidi="ar-SA"/>
         </w:rPr>
         <w:drawing>
-          <wp:inline distT="0" distB="0" distL="0" distR="0" wp14:anchorId="2CDBC63D" wp14:editId="0650DEF7">
-            <wp:extent cx="285790" cy="219106"/>
-            <wp:effectExtent l="0" t="0" r="0" b="9525"/>
-            <wp:docPr id="19" name="Picture 19"/>
+          <wp:inline distT="0" distB="0" distL="0" distR="0" wp14:anchorId="7EFB476E" wp14:editId="08F05448">
+            <wp:extent cx="4184160" cy="2896002"/>
+            <wp:effectExtent l="0" t="0" r="6985" b="0"/>
+            <wp:docPr id="15" name="Picture 15"/>
             <wp:cNvGraphicFramePr>
               <a:graphicFrameLocks xmlns:a="http://schemas.openxmlformats.org/drawingml/2006/main" noChangeAspect="1"/>
             </wp:cNvGraphicFramePr>
@@ -4335,7 +3977,7 @@
               <a:graphicData uri="http://schemas.openxmlformats.org/drawingml/2006/picture">
                 <pic:pic xmlns:pic="http://schemas.openxmlformats.org/drawingml/2006/picture">
                   <pic:nvPicPr>
-                    <pic:cNvPr id="0" name="5.3.b.png"/>
+                    <pic:cNvPr id="0" name="5.0.png"/>
                     <pic:cNvPicPr/>
                   </pic:nvPicPr>
                   <pic:blipFill>
@@ -4353,7 +3995,7 @@
                   <pic:spPr>
                     <a:xfrm>
                       <a:off x="0" y="0"/>
-                      <a:ext cx="285790" cy="219106"/>
+                      <a:ext cx="4184160" cy="2896002"/>
                     </a:xfrm>
                     <a:prstGeom prst="rect">
                       <a:avLst/>
@@ -4365,37 +4007,27 @@
           </wp:inline>
         </w:drawing>
       </w:r>
-      <w:r>
-        <w:rPr>
-          <w:rFonts w:cs="Times New Roman"/>
-        </w:rPr>
-        <w:t xml:space="preserve"> Association icon to associate .</w:t>
-      </w:r>
-      <w:proofErr w:type="spellStart"/>
-      <w:r>
-        <w:rPr>
-          <w:rFonts w:cs="Times New Roman"/>
-        </w:rPr>
-        <w:t>ibf</w:t>
-      </w:r>
-      <w:proofErr w:type="spellEnd"/>
-      <w:r>
-        <w:rPr>
-          <w:rFonts w:cs="Times New Roman"/>
-        </w:rPr>
-        <w:t xml:space="preserve"> </w:t>
-      </w:r>
-      <w:r>
-        <w:rPr>
-          <w:rFonts w:cs="Times New Roman"/>
-        </w:rPr>
-        <w:t>(IDM Backup File)</w:t>
-      </w:r>
-      <w:r>
-        <w:rPr>
-          <w:rFonts w:cs="Times New Roman"/>
-        </w:rPr>
-        <w:t xml:space="preserve"> file.</w:t>
+    </w:p>
+    <w:p>
+      <w:pPr>
+        <w:pStyle w:val="ListParagraph"/>
+        <w:numPr>
+          <w:ilvl w:val="0"/>
+          <w:numId w:val="20"/>
+        </w:numPr>
+        <w:rPr>
+          <w:rFonts w:cs="Times New Roman"/>
+          <w:b/>
+          <w:bCs/>
+        </w:rPr>
+      </w:pPr>
+      <w:r>
+        <w:rPr>
+          <w:rFonts w:cs="Times New Roman"/>
+          <w:b/>
+          <w:bCs/>
+        </w:rPr>
+        <w:t>Default Application Path</w:t>
       </w:r>
     </w:p>
     <w:p>
@@ -4407,6 +4039,475 @@
         </w:numPr>
         <w:rPr>
           <w:rFonts w:cs="Times New Roman"/>
+          <w:b/>
+          <w:bCs/>
+        </w:rPr>
+      </w:pPr>
+      <w:r>
+        <w:rPr>
+          <w:rFonts w:cs="Times New Roman"/>
+          <w:b/>
+          <w:bCs/>
+        </w:rPr>
+        <w:t>Log File Path:</w:t>
+      </w:r>
+      <w:r>
+        <w:rPr>
+          <w:rFonts w:cs="Times New Roman"/>
+        </w:rPr>
+        <w:t xml:space="preserve"> Where you </w:t>
+      </w:r>
+      <w:r>
+        <w:rPr>
+          <w:rFonts w:cs="Times New Roman"/>
+        </w:rPr>
+        <w:t>can</w:t>
+      </w:r>
+      <w:r>
+        <w:rPr>
+          <w:rFonts w:cs="Times New Roman"/>
+        </w:rPr>
+        <w:t xml:space="preserve"> save log file.</w:t>
+      </w:r>
+      <w:r>
+        <w:rPr>
+          <w:rFonts w:cs="Times New Roman"/>
+        </w:rPr>
+        <w:t xml:space="preserve"> Default Path is </w:t>
+      </w:r>
+      <w:r>
+        <w:rPr>
+          <w:rFonts w:cs="Times New Roman"/>
+          <w:b/>
+          <w:bCs/>
+        </w:rPr>
+        <w:t>@</w:t>
+      </w:r>
+      <w:r>
+        <w:rPr>
+          <w:rFonts w:cs="Times New Roman"/>
+          <w:b/>
+          <w:bCs/>
+        </w:rPr>
+        <w:t>User</w:t>
+      </w:r>
+      <w:r>
+        <w:rPr>
+          <w:rFonts w:cs="Times New Roman"/>
+          <w:b/>
+          <w:bCs/>
+        </w:rPr>
+        <w:t xml:space="preserve"> Profile</w:t>
+      </w:r>
+      <w:r>
+        <w:rPr>
+          <w:rFonts w:cs="Times New Roman"/>
+          <w:b/>
+          <w:bCs/>
+        </w:rPr>
+        <w:t>\</w:t>
+      </w:r>
+      <w:proofErr w:type="spellStart"/>
+      <w:r>
+        <w:rPr>
+          <w:rFonts w:cs="Times New Roman"/>
+          <w:b/>
+          <w:bCs/>
+        </w:rPr>
+        <w:t>AppData</w:t>
+      </w:r>
+      <w:proofErr w:type="spellEnd"/>
+      <w:r>
+        <w:rPr>
+          <w:rFonts w:cs="Times New Roman"/>
+          <w:b/>
+          <w:bCs/>
+        </w:rPr>
+        <w:t>\Roaming\IDM Backup Manager</w:t>
+      </w:r>
+      <w:r>
+        <w:rPr>
+          <w:rFonts w:cs="Times New Roman"/>
+          <w:b/>
+          <w:bCs/>
+        </w:rPr>
+        <w:t>\</w:t>
+      </w:r>
+      <w:r>
+        <w:rPr>
+          <w:rFonts w:cs="Times New Roman"/>
+          <w:b/>
+          <w:bCs/>
+        </w:rPr>
+        <w:t>LogFile.log</w:t>
+      </w:r>
+    </w:p>
+    <w:p>
+      <w:pPr>
+        <w:pStyle w:val="ListParagraph"/>
+        <w:numPr>
+          <w:ilvl w:val="1"/>
+          <w:numId w:val="20"/>
+        </w:numPr>
+        <w:rPr>
+          <w:rFonts w:cs="Times New Roman"/>
+          <w:b/>
+          <w:bCs/>
+        </w:rPr>
+      </w:pPr>
+      <w:r>
+        <w:rPr>
+          <w:rFonts w:cs="Times New Roman"/>
+          <w:b/>
+          <w:bCs/>
+        </w:rPr>
+        <w:t>Backup Folder:</w:t>
+      </w:r>
+      <w:r>
+        <w:rPr>
+          <w:rFonts w:cs="Times New Roman"/>
+        </w:rPr>
+        <w:t xml:space="preserve"> Where backup File saved by default Path is </w:t>
+      </w:r>
+      <w:r>
+        <w:rPr>
+          <w:rFonts w:cs="Times New Roman"/>
+          <w:b/>
+          <w:bCs/>
+        </w:rPr>
+        <w:t>@</w:t>
+      </w:r>
+      <w:r>
+        <w:rPr>
+          <w:rFonts w:cs="Times New Roman"/>
+          <w:b/>
+          <w:bCs/>
+        </w:rPr>
+        <w:t>User</w:t>
+      </w:r>
+      <w:r>
+        <w:rPr>
+          <w:rFonts w:cs="Times New Roman"/>
+          <w:b/>
+          <w:bCs/>
+        </w:rPr>
+        <w:t xml:space="preserve"> Profile </w:t>
+      </w:r>
+      <w:r>
+        <w:rPr>
+          <w:rFonts w:cs="Times New Roman"/>
+          <w:b/>
+          <w:bCs/>
+        </w:rPr>
+        <w:t>\Documents\IDM Backup Files</w:t>
+      </w:r>
+      <w:r>
+        <w:rPr>
+          <w:rFonts w:cs="Times New Roman"/>
+          <w:b/>
+          <w:bCs/>
+        </w:rPr>
+        <w:t>\</w:t>
+      </w:r>
+    </w:p>
+    <w:p>
+      <w:pPr>
+        <w:pStyle w:val="ListParagraph"/>
+        <w:numPr>
+          <w:ilvl w:val="1"/>
+          <w:numId w:val="20"/>
+        </w:numPr>
+        <w:rPr>
+          <w:rFonts w:cs="Times New Roman"/>
+          <w:b/>
+          <w:bCs/>
+        </w:rPr>
+      </w:pPr>
+      <w:r>
+        <w:rPr>
+          <w:rFonts w:cs="Times New Roman"/>
+          <w:b/>
+          <w:bCs/>
+        </w:rPr>
+        <w:t>Setting (</w:t>
+      </w:r>
+      <w:proofErr w:type="spellStart"/>
+      <w:r>
+        <w:rPr>
+          <w:rFonts w:cs="Times New Roman"/>
+          <w:b/>
+          <w:bCs/>
+        </w:rPr>
+        <w:t>ini</w:t>
+      </w:r>
+      <w:proofErr w:type="spellEnd"/>
+      <w:r>
+        <w:rPr>
+          <w:rFonts w:cs="Times New Roman"/>
+          <w:b/>
+          <w:bCs/>
+        </w:rPr>
+        <w:t>) File:</w:t>
+      </w:r>
+      <w:r>
+        <w:rPr>
+          <w:rFonts w:cs="Times New Roman"/>
+        </w:rPr>
+        <w:t xml:space="preserve"> Default Path</w:t>
+      </w:r>
+      <w:r>
+        <w:rPr>
+          <w:rFonts w:cs="Times New Roman"/>
+        </w:rPr>
+        <w:t>(it cannot changed)</w:t>
+      </w:r>
+      <w:r>
+        <w:rPr>
+          <w:rFonts w:cs="Times New Roman"/>
+        </w:rPr>
+        <w:t xml:space="preserve"> is </w:t>
+      </w:r>
+      <w:r>
+        <w:rPr>
+          <w:rFonts w:cs="Times New Roman"/>
+          <w:b/>
+          <w:bCs/>
+        </w:rPr>
+        <w:t>@User</w:t>
+      </w:r>
+      <w:r>
+        <w:rPr>
+          <w:rFonts w:cs="Times New Roman"/>
+          <w:b/>
+          <w:bCs/>
+        </w:rPr>
+        <w:t xml:space="preserve"> Profile </w:t>
+      </w:r>
+      <w:r>
+        <w:rPr>
+          <w:rFonts w:cs="Times New Roman"/>
+          <w:b/>
+          <w:bCs/>
+        </w:rPr>
+        <w:t>\</w:t>
+      </w:r>
+      <w:proofErr w:type="spellStart"/>
+      <w:r>
+        <w:rPr>
+          <w:rFonts w:cs="Times New Roman"/>
+          <w:b/>
+          <w:bCs/>
+        </w:rPr>
+        <w:t>AppData</w:t>
+      </w:r>
+      <w:proofErr w:type="spellEnd"/>
+      <w:r>
+        <w:rPr>
+          <w:rFonts w:cs="Times New Roman"/>
+          <w:b/>
+          <w:bCs/>
+        </w:rPr>
+        <w:t>\Roaming\IDM Backup Manager\SettingFile.ini</w:t>
+      </w:r>
+    </w:p>
+    <w:p>
+      <w:pPr>
+        <w:pStyle w:val="ListParagraph"/>
+        <w:numPr>
+          <w:ilvl w:val="0"/>
+          <w:numId w:val="20"/>
+        </w:numPr>
+        <w:rPr>
+          <w:rFonts w:cs="Times New Roman"/>
+          <w:b/>
+          <w:bCs/>
+        </w:rPr>
+      </w:pPr>
+      <w:r>
+        <w:rPr>
+          <w:rFonts w:cs="Times New Roman"/>
+          <w:b/>
+          <w:bCs/>
+        </w:rPr>
+        <w:t>Default Profile</w:t>
+      </w:r>
+    </w:p>
+    <w:p>
+      <w:pPr>
+        <w:pStyle w:val="ListParagraph"/>
+        <w:numPr>
+          <w:ilvl w:val="1"/>
+          <w:numId w:val="20"/>
+        </w:numPr>
+        <w:rPr>
+          <w:rFonts w:cs="Times New Roman"/>
+          <w:b/>
+          <w:bCs/>
+        </w:rPr>
+      </w:pPr>
+      <w:proofErr w:type="spellStart"/>
+      <w:r>
+        <w:rPr>
+          <w:rFonts w:cs="Times New Roman"/>
+          <w:b/>
+          <w:bCs/>
+        </w:rPr>
+        <w:t>AppData</w:t>
+      </w:r>
+      <w:proofErr w:type="spellEnd"/>
+      <w:r>
+        <w:rPr>
+          <w:rFonts w:cs="Times New Roman"/>
+          <w:b/>
+          <w:bCs/>
+        </w:rPr>
+        <w:t xml:space="preserve"> Folder:</w:t>
+      </w:r>
+      <w:r>
+        <w:rPr>
+          <w:rFonts w:cs="Times New Roman"/>
+        </w:rPr>
+        <w:t xml:space="preserve"> IDM Default Profile Folder. Default Path is </w:t>
+      </w:r>
+      <w:r>
+        <w:rPr>
+          <w:rFonts w:cs="Times New Roman"/>
+          <w:b/>
+          <w:bCs/>
+        </w:rPr>
+        <w:t>@User Profile\</w:t>
+      </w:r>
+      <w:proofErr w:type="spellStart"/>
+      <w:r>
+        <w:rPr>
+          <w:rFonts w:cs="Times New Roman"/>
+          <w:b/>
+          <w:bCs/>
+        </w:rPr>
+        <w:t>AppData</w:t>
+      </w:r>
+      <w:proofErr w:type="spellEnd"/>
+      <w:r>
+        <w:rPr>
+          <w:rFonts w:cs="Times New Roman"/>
+          <w:b/>
+          <w:bCs/>
+        </w:rPr>
+        <w:t>\Roaming\IDM\</w:t>
+      </w:r>
+    </w:p>
+    <w:p>
+      <w:pPr>
+        <w:pStyle w:val="ListParagraph"/>
+        <w:numPr>
+          <w:ilvl w:val="1"/>
+          <w:numId w:val="20"/>
+        </w:numPr>
+        <w:rPr>
+          <w:rFonts w:cs="Times New Roman"/>
+        </w:rPr>
+      </w:pPr>
+      <w:proofErr w:type="spellStart"/>
+      <w:r>
+        <w:rPr>
+          <w:rFonts w:cs="Times New Roman"/>
+          <w:b/>
+          <w:bCs/>
+        </w:rPr>
+        <w:lastRenderedPageBreak/>
+        <w:t>DonlData</w:t>
+      </w:r>
+      <w:proofErr w:type="spellEnd"/>
+      <w:r>
+        <w:rPr>
+          <w:rFonts w:cs="Times New Roman"/>
+          <w:b/>
+          <w:bCs/>
+        </w:rPr>
+        <w:t xml:space="preserve"> Folder: </w:t>
+      </w:r>
+      <w:r>
+        <w:rPr>
+          <w:rFonts w:cs="Times New Roman"/>
+        </w:rPr>
+        <w:t xml:space="preserve">Where Unfinished Downloads data saved. By default path is </w:t>
+      </w:r>
+      <w:r>
+        <w:rPr>
+          <w:rFonts w:cs="Times New Roman"/>
+          <w:b/>
+          <w:bCs/>
+        </w:rPr>
+        <w:t>@User Profile\</w:t>
+      </w:r>
+      <w:proofErr w:type="spellStart"/>
+      <w:r>
+        <w:rPr>
+          <w:rFonts w:cs="Times New Roman"/>
+          <w:b/>
+          <w:bCs/>
+        </w:rPr>
+        <w:t>AppData</w:t>
+      </w:r>
+      <w:proofErr w:type="spellEnd"/>
+      <w:r>
+        <w:rPr>
+          <w:rFonts w:cs="Times New Roman"/>
+          <w:b/>
+          <w:bCs/>
+        </w:rPr>
+        <w:t>\Roaming\IDM\</w:t>
+      </w:r>
+      <w:proofErr w:type="spellStart"/>
+      <w:r>
+        <w:rPr>
+          <w:rFonts w:cs="Times New Roman"/>
+          <w:b/>
+          <w:bCs/>
+        </w:rPr>
+        <w:t>DwnlData</w:t>
+      </w:r>
+      <w:proofErr w:type="spellEnd"/>
+      <w:r>
+        <w:rPr>
+          <w:rFonts w:cs="Times New Roman"/>
+          <w:b/>
+          <w:bCs/>
+        </w:rPr>
+        <w:t>\</w:t>
+      </w:r>
+    </w:p>
+    <w:p>
+      <w:pPr>
+        <w:pStyle w:val="ListParagraph"/>
+        <w:numPr>
+          <w:ilvl w:val="0"/>
+          <w:numId w:val="20"/>
+        </w:numPr>
+        <w:rPr>
+          <w:rFonts w:cs="Times New Roman"/>
+          <w:b/>
+          <w:bCs/>
+        </w:rPr>
+      </w:pPr>
+      <w:r>
+        <w:rPr>
+          <w:rFonts w:cs="Times New Roman"/>
+          <w:b/>
+          <w:bCs/>
+        </w:rPr>
+        <w:t>More Setting</w:t>
+      </w:r>
+    </w:p>
+    <w:p>
+      <w:pPr>
+        <w:pStyle w:val="ListParagraph"/>
+        <w:numPr>
+          <w:ilvl w:val="1"/>
+          <w:numId w:val="20"/>
+        </w:numPr>
+        <w:rPr>
+          <w:rFonts w:cs="Times New Roman"/>
         </w:rPr>
       </w:pPr>
       <w:r>
@@ -4422,10 +4523,10 @@
           <w:lang w:bidi="ar-SA"/>
         </w:rPr>
         <w:drawing>
-          <wp:inline distT="0" distB="0" distL="0" distR="0" wp14:anchorId="6786642C" wp14:editId="29BDDFE6">
+          <wp:inline distT="0" distB="0" distL="0" distR="0" wp14:anchorId="06DDF174" wp14:editId="0B849176">
             <wp:extent cx="285790" cy="219106"/>
             <wp:effectExtent l="0" t="0" r="0" b="9525"/>
-            <wp:docPr id="20" name="Picture 20"/>
+            <wp:docPr id="14" name="Picture 14"/>
             <wp:cNvGraphicFramePr>
               <a:graphicFrameLocks xmlns:a="http://schemas.openxmlformats.org/drawingml/2006/main" noChangeAspect="1"/>
             </wp:cNvGraphicFramePr>
@@ -4433,7 +4534,7 @@
               <a:graphicData uri="http://schemas.openxmlformats.org/drawingml/2006/picture">
                 <pic:pic xmlns:pic="http://schemas.openxmlformats.org/drawingml/2006/picture">
                   <pic:nvPicPr>
-                    <pic:cNvPr id="0" name="5.3.c.png"/>
+                    <pic:cNvPr id="0" name="5.3.a.png"/>
                     <pic:cNvPicPr/>
                   </pic:nvPicPr>
                   <pic:blipFill>
@@ -4467,6 +4568,256 @@
         <w:rPr>
           <w:rFonts w:cs="Times New Roman"/>
         </w:rPr>
+        <w:t xml:space="preserve"> Setting </w:t>
+      </w:r>
+      <w:r>
+        <w:rPr>
+          <w:rFonts w:cs="Times New Roman"/>
+        </w:rPr>
+        <w:t>icon to change Some more setting:</w:t>
+      </w:r>
+    </w:p>
+    <w:p>
+      <w:pPr>
+        <w:pStyle w:val="ListParagraph"/>
+        <w:numPr>
+          <w:ilvl w:val="2"/>
+          <w:numId w:val="20"/>
+        </w:numPr>
+        <w:rPr>
+          <w:rFonts w:cs="Times New Roman"/>
+        </w:rPr>
+      </w:pPr>
+      <w:r>
+        <w:rPr>
+          <w:rFonts w:cs="Times New Roman"/>
+        </w:rPr>
+        <w:t xml:space="preserve">Log File will append on every Session </w:t>
+      </w:r>
+      <w:r>
+        <w:rPr>
+          <w:rFonts w:cs="Times New Roman"/>
+        </w:rPr>
+        <w:t xml:space="preserve">or </w:t>
+      </w:r>
+      <w:proofErr w:type="gramStart"/>
+      <w:r>
+        <w:rPr>
+          <w:rFonts w:cs="Times New Roman"/>
+        </w:rPr>
+        <w:t>Not</w:t>
+      </w:r>
+      <w:r>
+        <w:rPr>
+          <w:rFonts w:cs="Times New Roman"/>
+        </w:rPr>
+        <w:t>(</w:t>
+      </w:r>
+      <w:proofErr w:type="gramEnd"/>
+      <w:r>
+        <w:rPr>
+          <w:rFonts w:cs="Times New Roman"/>
+        </w:rPr>
+        <w:t>On startup).</w:t>
+      </w:r>
+    </w:p>
+    <w:p>
+      <w:pPr>
+        <w:pStyle w:val="ListParagraph"/>
+        <w:numPr>
+          <w:ilvl w:val="2"/>
+          <w:numId w:val="20"/>
+        </w:numPr>
+        <w:rPr>
+          <w:rFonts w:cs="Times New Roman"/>
+        </w:rPr>
+      </w:pPr>
+      <w:r>
+        <w:rPr>
+          <w:rFonts w:cs="Times New Roman"/>
+        </w:rPr>
+        <w:t>Restart IDM every time on restore</w:t>
+      </w:r>
+      <w:r>
+        <w:rPr>
+          <w:rFonts w:cs="Times New Roman"/>
+        </w:rPr>
+        <w:t xml:space="preserve"> or Not</w:t>
+      </w:r>
+      <w:r>
+        <w:rPr>
+          <w:rFonts w:cs="Times New Roman"/>
+        </w:rPr>
+        <w:t>.</w:t>
+      </w:r>
+    </w:p>
+    <w:p>
+      <w:pPr>
+        <w:pStyle w:val="ListParagraph"/>
+        <w:numPr>
+          <w:ilvl w:val="1"/>
+          <w:numId w:val="20"/>
+        </w:numPr>
+        <w:rPr>
+          <w:rFonts w:cs="Times New Roman"/>
+        </w:rPr>
+      </w:pPr>
+      <w:r>
+        <w:rPr>
+          <w:rFonts w:cs="Times New Roman"/>
+        </w:rPr>
+        <w:t xml:space="preserve">Click on </w:t>
+      </w:r>
+      <w:r>
+        <w:rPr>
+          <w:rFonts w:cs="Times New Roman"/>
+          <w:noProof/>
+          <w:lang w:bidi="ar-SA"/>
+        </w:rPr>
+        <w:drawing>
+          <wp:inline distT="0" distB="0" distL="0" distR="0" wp14:anchorId="77CD16AF" wp14:editId="11EC27F8">
+            <wp:extent cx="285790" cy="219106"/>
+            <wp:effectExtent l="0" t="0" r="0" b="9525"/>
+            <wp:docPr id="19" name="Picture 19"/>
+            <wp:cNvGraphicFramePr>
+              <a:graphicFrameLocks xmlns:a="http://schemas.openxmlformats.org/drawingml/2006/main" noChangeAspect="1"/>
+            </wp:cNvGraphicFramePr>
+            <a:graphic xmlns:a="http://schemas.openxmlformats.org/drawingml/2006/main">
+              <a:graphicData uri="http://schemas.openxmlformats.org/drawingml/2006/picture">
+                <pic:pic xmlns:pic="http://schemas.openxmlformats.org/drawingml/2006/picture">
+                  <pic:nvPicPr>
+                    <pic:cNvPr id="0" name="5.3.b.png"/>
+                    <pic:cNvPicPr/>
+                  </pic:nvPicPr>
+                  <pic:blipFill>
+                    <a:blip r:embed="rId23">
+                      <a:extLst>
+                        <a:ext uri="{28A0092B-C50C-407E-A947-70E740481C1C}">
+                          <a14:useLocalDpi xmlns:a14="http://schemas.microsoft.com/office/drawing/2010/main" val="0"/>
+                        </a:ext>
+                      </a:extLst>
+                    </a:blip>
+                    <a:stretch>
+                      <a:fillRect/>
+                    </a:stretch>
+                  </pic:blipFill>
+                  <pic:spPr>
+                    <a:xfrm>
+                      <a:off x="0" y="0"/>
+                      <a:ext cx="285790" cy="219106"/>
+                    </a:xfrm>
+                    <a:prstGeom prst="rect">
+                      <a:avLst/>
+                    </a:prstGeom>
+                  </pic:spPr>
+                </pic:pic>
+              </a:graphicData>
+            </a:graphic>
+          </wp:inline>
+        </w:drawing>
+      </w:r>
+      <w:r>
+        <w:rPr>
+          <w:rFonts w:cs="Times New Roman"/>
+        </w:rPr>
+        <w:t xml:space="preserve"> Association icon to associate .</w:t>
+      </w:r>
+      <w:proofErr w:type="spellStart"/>
+      <w:r>
+        <w:rPr>
+          <w:rFonts w:cs="Times New Roman"/>
+        </w:rPr>
+        <w:t>ibf</w:t>
+      </w:r>
+      <w:proofErr w:type="spellEnd"/>
+      <w:r>
+        <w:rPr>
+          <w:rFonts w:cs="Times New Roman"/>
+        </w:rPr>
+        <w:t xml:space="preserve"> </w:t>
+      </w:r>
+      <w:r>
+        <w:rPr>
+          <w:rFonts w:cs="Times New Roman"/>
+        </w:rPr>
+        <w:t>(IDM Backup File)</w:t>
+      </w:r>
+      <w:r>
+        <w:rPr>
+          <w:rFonts w:cs="Times New Roman"/>
+        </w:rPr>
+        <w:t xml:space="preserve"> file.</w:t>
+      </w:r>
+    </w:p>
+    <w:p>
+      <w:pPr>
+        <w:pStyle w:val="ListParagraph"/>
+        <w:numPr>
+          <w:ilvl w:val="1"/>
+          <w:numId w:val="20"/>
+        </w:numPr>
+        <w:rPr>
+          <w:rFonts w:cs="Times New Roman"/>
+        </w:rPr>
+      </w:pPr>
+      <w:r>
+        <w:rPr>
+          <w:rFonts w:cs="Times New Roman"/>
+        </w:rPr>
+        <w:t xml:space="preserve">Click on </w:t>
+      </w:r>
+      <w:r>
+        <w:rPr>
+          <w:rFonts w:cs="Times New Roman"/>
+          <w:noProof/>
+          <w:lang w:bidi="ar-SA"/>
+        </w:rPr>
+        <w:drawing>
+          <wp:inline distT="0" distB="0" distL="0" distR="0" wp14:anchorId="2BC61A41" wp14:editId="69E9FC30">
+            <wp:extent cx="285790" cy="219106"/>
+            <wp:effectExtent l="0" t="0" r="0" b="9525"/>
+            <wp:docPr id="20" name="Picture 20"/>
+            <wp:cNvGraphicFramePr>
+              <a:graphicFrameLocks xmlns:a="http://schemas.openxmlformats.org/drawingml/2006/main" noChangeAspect="1"/>
+            </wp:cNvGraphicFramePr>
+            <a:graphic xmlns:a="http://schemas.openxmlformats.org/drawingml/2006/main">
+              <a:graphicData uri="http://schemas.openxmlformats.org/drawingml/2006/picture">
+                <pic:pic xmlns:pic="http://schemas.openxmlformats.org/drawingml/2006/picture">
+                  <pic:nvPicPr>
+                    <pic:cNvPr id="0" name="5.3.c.png"/>
+                    <pic:cNvPicPr/>
+                  </pic:nvPicPr>
+                  <pic:blipFill>
+                    <a:blip r:embed="rId24">
+                      <a:extLst>
+                        <a:ext uri="{28A0092B-C50C-407E-A947-70E740481C1C}">
+                          <a14:useLocalDpi xmlns:a14="http://schemas.microsoft.com/office/drawing/2010/main" val="0"/>
+                        </a:ext>
+                      </a:extLst>
+                    </a:blip>
+                    <a:stretch>
+                      <a:fillRect/>
+                    </a:stretch>
+                  </pic:blipFill>
+                  <pic:spPr>
+                    <a:xfrm>
+                      <a:off x="0" y="0"/>
+                      <a:ext cx="285790" cy="219106"/>
+                    </a:xfrm>
+                    <a:prstGeom prst="rect">
+                      <a:avLst/>
+                    </a:prstGeom>
+                  </pic:spPr>
+                </pic:pic>
+              </a:graphicData>
+            </a:graphic>
+          </wp:inline>
+        </w:drawing>
+      </w:r>
+      <w:r>
+        <w:rPr>
+          <w:rFonts w:cs="Times New Roman"/>
+        </w:rPr>
         <w:t xml:space="preserve"> Restore default icon to default all setting including default profile.</w:t>
       </w:r>
     </w:p>
@@ -4486,9 +4837,11 @@
           <w:rFonts w:cs="Times New Roman"/>
         </w:rPr>
       </w:pPr>
-      <w:bookmarkStart w:id="38" w:name="_5._FAQS_and"/>
-      <w:bookmarkStart w:id="39" w:name="_Toc338444620"/>
-      <w:bookmarkEnd w:id="38"/>
+      <w:bookmarkStart w:id="53" w:name="_5._FAQS_and"/>
+      <w:bookmarkStart w:id="54" w:name="_6._FAQS_and"/>
+      <w:bookmarkStart w:id="55" w:name="_Toc338444620"/>
+      <w:bookmarkEnd w:id="53"/>
+      <w:bookmarkEnd w:id="54"/>
       <w:r>
         <w:rPr>
           <w:rFonts w:cs="Times New Roman"/>
@@ -4519,7 +4872,7 @@
         </w:rPr>
         <w:t xml:space="preserve"> Notes</w:t>
       </w:r>
-      <w:bookmarkEnd w:id="39"/>
+      <w:bookmarkEnd w:id="55"/>
       <w:r>
         <w:rPr>
           <w:rFonts w:cs="Times New Roman"/>
@@ -4527,7 +4880,7 @@
           <w:lang w:bidi="ar-SA"/>
         </w:rPr>
         <w:drawing>
-          <wp:inline distT="0" distB="0" distL="0" distR="0">
+          <wp:inline distT="0" distB="0" distL="0" distR="0" wp14:anchorId="507CAFB4" wp14:editId="5A6D664E">
             <wp:extent cx="190500" cy="190500"/>
             <wp:effectExtent l="0" t="0" r="0" b="0"/>
             <wp:docPr id="16" name="Picture 0" descr="thumbs_up.gif">
@@ -4798,9 +5151,11 @@
           <w:rFonts w:cs="Times New Roman"/>
         </w:rPr>
       </w:pPr>
-      <w:bookmarkStart w:id="40" w:name="_6._Support,_Contact"/>
-      <w:bookmarkStart w:id="41" w:name="_Toc338444621"/>
-      <w:bookmarkEnd w:id="40"/>
+      <w:bookmarkStart w:id="56" w:name="_6._Support,_Contact"/>
+      <w:bookmarkStart w:id="57" w:name="_7._Support,_Contact"/>
+      <w:bookmarkStart w:id="58" w:name="_Toc338444621"/>
+      <w:bookmarkEnd w:id="56"/>
+      <w:bookmarkEnd w:id="57"/>
       <w:r>
         <w:rPr>
           <w:rFonts w:cs="Times New Roman"/>
@@ -4819,7 +5174,7 @@
         </w:rPr>
         <w:t>, Contact and Bug Reporting</w:t>
       </w:r>
-      <w:bookmarkEnd w:id="41"/>
+      <w:bookmarkEnd w:id="58"/>
       <w:r>
         <w:rPr>
           <w:rFonts w:cs="Times New Roman"/>
@@ -4827,7 +5182,7 @@
           <w:lang w:bidi="ar-SA"/>
         </w:rPr>
         <w:drawing>
-          <wp:inline distT="0" distB="0" distL="0" distR="0">
+          <wp:inline distT="0" distB="0" distL="0" distR="0" wp14:anchorId="4898E3F7" wp14:editId="2C6E5CAA">
             <wp:extent cx="190500" cy="190500"/>
             <wp:effectExtent l="0" t="0" r="0" b="0"/>
             <wp:docPr id="17" name="Picture 0" descr="thumbs_up.gif">
@@ -4928,7 +5283,7 @@
               </w:rPr>
               <w:t xml:space="preserve"> </w:t>
             </w:r>
-            <w:hyperlink r:id="rId23" w:history="1">
+            <w:hyperlink r:id="rId25" w:history="1">
               <w:r>
                 <w:rPr>
                   <w:rStyle w:val="Hyperlink"/>
@@ -4986,7 +5341,7 @@
               </w:rPr>
               <w:t xml:space="preserve"> </w:t>
             </w:r>
-            <w:hyperlink r:id="rId24" w:tgtFrame="_blank" w:history="1">
+            <w:hyperlink r:id="rId26" w:tgtFrame="_blank" w:history="1">
               <w:r>
                 <w:rPr>
                   <w:rStyle w:val="Hyperlink"/>
@@ -5038,7 +5393,7 @@
               </w:rPr>
               <w:t>:</w:t>
             </w:r>
-            <w:hyperlink r:id="rId25" w:tgtFrame="_blank" w:history="1">
+            <w:hyperlink r:id="rId27" w:tgtFrame="_blank" w:history="1">
               <w:r>
                 <w:rPr>
                   <w:rStyle w:val="Hyperlink"/>
@@ -5090,7 +5445,7 @@
               </w:rPr>
               <w:t>:</w:t>
             </w:r>
-            <w:hyperlink r:id="rId26" w:tgtFrame="_blank" w:history="1">
+            <w:hyperlink r:id="rId28" w:tgtFrame="_blank" w:history="1">
               <w:r>
                 <w:rPr>
                   <w:rStyle w:val="Hyperlink"/>
@@ -5137,7 +5492,7 @@
                     <pic:cNvPicPr/>
                   </pic:nvPicPr>
                   <pic:blipFill>
-                    <a:blip r:embed="rId27"/>
+                    <a:blip r:embed="rId29"/>
                     <a:stretch>
                       <a:fillRect/>
                     </a:stretch>
@@ -5171,6 +5526,127 @@
 <file path=word/numbering.xml><?xml version="1.0" encoding="utf-8"?>
 <w:numbering xmlns:wpc="http://schemas.microsoft.com/office/word/2010/wordprocessingCanvas" xmlns:mc="http://schemas.openxmlformats.org/markup-compatibility/2006" xmlns:o="urn:schemas-microsoft-com:office:office" xmlns:r="http://schemas.openxmlformats.org/officeDocument/2006/relationships" xmlns:m="http://schemas.openxmlformats.org/officeDocument/2006/math" xmlns:v="urn:schemas-microsoft-com:vml" xmlns:wp14="http://schemas.microsoft.com/office/word/2010/wordprocessingDrawing" xmlns:wp="http://schemas.openxmlformats.org/drawingml/2006/wordprocessingDrawing" xmlns:w10="urn:schemas-microsoft-com:office:word" xmlns:w="http://schemas.openxmlformats.org/wordprocessingml/2006/main" xmlns:w14="http://schemas.microsoft.com/office/word/2010/wordml" xmlns:wpg="http://schemas.microsoft.com/office/word/2010/wordprocessingGroup" xmlns:wpi="http://schemas.microsoft.com/office/word/2010/wordprocessingInk" xmlns:wne="http://schemas.microsoft.com/office/word/2006/wordml" xmlns:wps="http://schemas.microsoft.com/office/word/2010/wordprocessingShape" mc:Ignorable="w14 wp14">
   <w:abstractNum w:abstractNumId="0">
+    <w:nsid w:val="003D5CD4"/>
+    <w:multiLevelType w:val="multilevel"/>
+    <w:tmpl w:val="9A80B0BA"/>
+    <w:lvl w:ilvl="0">
+      <w:start w:val="1"/>
+      <w:numFmt w:val="decimal"/>
+      <w:lvlText w:val="%1."/>
+      <w:lvlJc w:val="left"/>
+      <w:pPr>
+        <w:ind w:left="1080" w:hanging="720"/>
+      </w:pPr>
+      <w:rPr>
+        <w:rFonts w:hint="default"/>
+      </w:rPr>
+    </w:lvl>
+    <w:lvl w:ilvl="1">
+      <w:start w:val="1"/>
+      <w:numFmt w:val="decimal"/>
+      <w:isLgl/>
+      <w:lvlText w:val="%1.%2."/>
+      <w:lvlJc w:val="left"/>
+      <w:pPr>
+        <w:ind w:left="1080" w:hanging="720"/>
+      </w:pPr>
+      <w:rPr>
+        <w:rFonts w:hint="default"/>
+      </w:rPr>
+    </w:lvl>
+    <w:lvl w:ilvl="2">
+      <w:start w:val="1"/>
+      <w:numFmt w:val="decimal"/>
+      <w:isLgl/>
+      <w:lvlText w:val="%1.%2.%3."/>
+      <w:lvlJc w:val="left"/>
+      <w:pPr>
+        <w:ind w:left="1080" w:hanging="720"/>
+      </w:pPr>
+      <w:rPr>
+        <w:rFonts w:hint="default"/>
+      </w:rPr>
+    </w:lvl>
+    <w:lvl w:ilvl="3">
+      <w:start w:val="1"/>
+      <w:numFmt w:val="decimal"/>
+      <w:isLgl/>
+      <w:lvlText w:val="%1.%2.%3.%4."/>
+      <w:lvlJc w:val="left"/>
+      <w:pPr>
+        <w:ind w:left="1080" w:hanging="720"/>
+      </w:pPr>
+      <w:rPr>
+        <w:rFonts w:hint="default"/>
+      </w:rPr>
+    </w:lvl>
+    <w:lvl w:ilvl="4">
+      <w:start w:val="1"/>
+      <w:numFmt w:val="decimal"/>
+      <w:isLgl/>
+      <w:lvlText w:val="%1.%2.%3.%4.%5."/>
+      <w:lvlJc w:val="left"/>
+      <w:pPr>
+        <w:ind w:left="1440" w:hanging="1080"/>
+      </w:pPr>
+      <w:rPr>
+        <w:rFonts w:hint="default"/>
+      </w:rPr>
+    </w:lvl>
+    <w:lvl w:ilvl="5">
+      <w:start w:val="1"/>
+      <w:numFmt w:val="decimal"/>
+      <w:isLgl/>
+      <w:lvlText w:val="%1.%2.%3.%4.%5.%6."/>
+      <w:lvlJc w:val="left"/>
+      <w:pPr>
+        <w:ind w:left="1440" w:hanging="1080"/>
+      </w:pPr>
+      <w:rPr>
+        <w:rFonts w:hint="default"/>
+      </w:rPr>
+    </w:lvl>
+    <w:lvl w:ilvl="6">
+      <w:start w:val="1"/>
+      <w:numFmt w:val="decimal"/>
+      <w:isLgl/>
+      <w:lvlText w:val="%1.%2.%3.%4.%5.%6.%7."/>
+      <w:lvlJc w:val="left"/>
+      <w:pPr>
+        <w:ind w:left="1800" w:hanging="1440"/>
+      </w:pPr>
+      <w:rPr>
+        <w:rFonts w:hint="default"/>
+      </w:rPr>
+    </w:lvl>
+    <w:lvl w:ilvl="7">
+      <w:start w:val="1"/>
+      <w:numFmt w:val="decimal"/>
+      <w:isLgl/>
+      <w:lvlText w:val="%1.%2.%3.%4.%5.%6.%7.%8."/>
+      <w:lvlJc w:val="left"/>
+      <w:pPr>
+        <w:ind w:left="1800" w:hanging="1440"/>
+      </w:pPr>
+      <w:rPr>
+        <w:rFonts w:hint="default"/>
+      </w:rPr>
+    </w:lvl>
+    <w:lvl w:ilvl="8">
+      <w:start w:val="1"/>
+      <w:numFmt w:val="decimal"/>
+      <w:isLgl/>
+      <w:lvlText w:val="%1.%2.%3.%4.%5.%6.%7.%8.%9."/>
+      <w:lvlJc w:val="left"/>
+      <w:pPr>
+        <w:ind w:left="2160" w:hanging="1800"/>
+      </w:pPr>
+      <w:rPr>
+        <w:rFonts w:hint="default"/>
+      </w:rPr>
+    </w:lvl>
+  </w:abstractNum>
+  <w:abstractNum w:abstractNumId="1">
     <w:nsid w:val="0537374B"/>
     <w:multiLevelType w:val="multilevel"/>
     <w:tmpl w:val="0409001F"/>
@@ -5256,7 +5732,7 @@
       </w:pPr>
     </w:lvl>
   </w:abstractNum>
-  <w:abstractNum w:abstractNumId="1">
+  <w:abstractNum w:abstractNumId="2">
     <w:nsid w:val="0A174D4B"/>
     <w:multiLevelType w:val="hybridMultilevel"/>
     <w:tmpl w:val="EE5009B0"/>
@@ -5342,7 +5818,7 @@
       </w:pPr>
     </w:lvl>
   </w:abstractNum>
-  <w:abstractNum w:abstractNumId="2">
+  <w:abstractNum w:abstractNumId="3">
     <w:nsid w:val="13920989"/>
     <w:multiLevelType w:val="hybridMultilevel"/>
     <w:tmpl w:val="D48CA21E"/>
@@ -5455,7 +5931,7 @@
       </w:rPr>
     </w:lvl>
   </w:abstractNum>
-  <w:abstractNum w:abstractNumId="3">
+  <w:abstractNum w:abstractNumId="4">
     <w:nsid w:val="156C786F"/>
     <w:multiLevelType w:val="hybridMultilevel"/>
     <w:tmpl w:val="1132E98C"/>
@@ -5541,7 +6017,7 @@
       </w:pPr>
     </w:lvl>
   </w:abstractNum>
-  <w:abstractNum w:abstractNumId="4">
+  <w:abstractNum w:abstractNumId="5">
     <w:nsid w:val="16AC777C"/>
     <w:multiLevelType w:val="hybridMultilevel"/>
     <w:tmpl w:val="4008BE76"/>
@@ -5627,7 +6103,7 @@
       </w:pPr>
     </w:lvl>
   </w:abstractNum>
-  <w:abstractNum w:abstractNumId="5">
+  <w:abstractNum w:abstractNumId="6">
     <w:nsid w:val="19395BF7"/>
     <w:multiLevelType w:val="hybridMultilevel"/>
     <w:tmpl w:val="C4405D26"/>
@@ -5713,7 +6189,7 @@
       </w:pPr>
     </w:lvl>
   </w:abstractNum>
-  <w:abstractNum w:abstractNumId="6">
+  <w:abstractNum w:abstractNumId="7">
     <w:nsid w:val="19A87C78"/>
     <w:multiLevelType w:val="hybridMultilevel"/>
     <w:tmpl w:val="D6DE82D2"/>
@@ -5799,7 +6275,7 @@
       </w:pPr>
     </w:lvl>
   </w:abstractNum>
-  <w:abstractNum w:abstractNumId="7">
+  <w:abstractNum w:abstractNumId="8">
     <w:nsid w:val="20686AE6"/>
     <w:multiLevelType w:val="hybridMultilevel"/>
     <w:tmpl w:val="B0A2A676"/>
@@ -5912,7 +6388,7 @@
       </w:rPr>
     </w:lvl>
   </w:abstractNum>
-  <w:abstractNum w:abstractNumId="8">
+  <w:abstractNum w:abstractNumId="9">
     <w:nsid w:val="27616AF5"/>
     <w:multiLevelType w:val="hybridMultilevel"/>
     <w:tmpl w:val="0E50931A"/>
@@ -5998,7 +6474,7 @@
       </w:pPr>
     </w:lvl>
   </w:abstractNum>
-  <w:abstractNum w:abstractNumId="9">
+  <w:abstractNum w:abstractNumId="10">
     <w:nsid w:val="286E4CA4"/>
     <w:multiLevelType w:val="hybridMultilevel"/>
     <w:tmpl w:val="78AE1536"/>
@@ -6084,7 +6560,7 @@
       </w:pPr>
     </w:lvl>
   </w:abstractNum>
-  <w:abstractNum w:abstractNumId="10">
+  <w:abstractNum w:abstractNumId="11">
     <w:nsid w:val="4C4B2F46"/>
     <w:multiLevelType w:val="hybridMultilevel"/>
     <w:tmpl w:val="B9C68EE8"/>
@@ -6197,7 +6673,93 @@
       </w:rPr>
     </w:lvl>
   </w:abstractNum>
-  <w:abstractNum w:abstractNumId="11">
+  <w:abstractNum w:abstractNumId="12">
+    <w:nsid w:val="4EA66C24"/>
+    <w:multiLevelType w:val="multilevel"/>
+    <w:tmpl w:val="0409001F"/>
+    <w:lvl w:ilvl="0">
+      <w:start w:val="1"/>
+      <w:numFmt w:val="decimal"/>
+      <w:lvlText w:val="%1."/>
+      <w:lvlJc w:val="left"/>
+      <w:pPr>
+        <w:ind w:left="360" w:hanging="360"/>
+      </w:pPr>
+    </w:lvl>
+    <w:lvl w:ilvl="1">
+      <w:start w:val="1"/>
+      <w:numFmt w:val="decimal"/>
+      <w:lvlText w:val="%1.%2."/>
+      <w:lvlJc w:val="left"/>
+      <w:pPr>
+        <w:ind w:left="792" w:hanging="432"/>
+      </w:pPr>
+    </w:lvl>
+    <w:lvl w:ilvl="2">
+      <w:start w:val="1"/>
+      <w:numFmt w:val="decimal"/>
+      <w:lvlText w:val="%1.%2.%3."/>
+      <w:lvlJc w:val="left"/>
+      <w:pPr>
+        <w:ind w:left="1224" w:hanging="504"/>
+      </w:pPr>
+    </w:lvl>
+    <w:lvl w:ilvl="3">
+      <w:start w:val="1"/>
+      <w:numFmt w:val="decimal"/>
+      <w:lvlText w:val="%1.%2.%3.%4."/>
+      <w:lvlJc w:val="left"/>
+      <w:pPr>
+        <w:ind w:left="1728" w:hanging="648"/>
+      </w:pPr>
+    </w:lvl>
+    <w:lvl w:ilvl="4">
+      <w:start w:val="1"/>
+      <w:numFmt w:val="decimal"/>
+      <w:lvlText w:val="%1.%2.%3.%4.%5."/>
+      <w:lvlJc w:val="left"/>
+      <w:pPr>
+        <w:ind w:left="2232" w:hanging="792"/>
+      </w:pPr>
+    </w:lvl>
+    <w:lvl w:ilvl="5">
+      <w:start w:val="1"/>
+      <w:numFmt w:val="decimal"/>
+      <w:lvlText w:val="%1.%2.%3.%4.%5.%6."/>
+      <w:lvlJc w:val="left"/>
+      <w:pPr>
+        <w:ind w:left="2736" w:hanging="936"/>
+      </w:pPr>
+    </w:lvl>
+    <w:lvl w:ilvl="6">
+      <w:start w:val="1"/>
+      <w:numFmt w:val="decimal"/>
+      <w:lvlText w:val="%1.%2.%3.%4.%5.%6.%7."/>
+      <w:lvlJc w:val="left"/>
+      <w:pPr>
+        <w:ind w:left="3240" w:hanging="1080"/>
+      </w:pPr>
+    </w:lvl>
+    <w:lvl w:ilvl="7">
+      <w:start w:val="1"/>
+      <w:numFmt w:val="decimal"/>
+      <w:lvlText w:val="%1.%2.%3.%4.%5.%6.%7.%8."/>
+      <w:lvlJc w:val="left"/>
+      <w:pPr>
+        <w:ind w:left="3744" w:hanging="1224"/>
+      </w:pPr>
+    </w:lvl>
+    <w:lvl w:ilvl="8">
+      <w:start w:val="1"/>
+      <w:numFmt w:val="decimal"/>
+      <w:lvlText w:val="%1.%2.%3.%4.%5.%6.%7.%8.%9."/>
+      <w:lvlJc w:val="left"/>
+      <w:pPr>
+        <w:ind w:left="4320" w:hanging="1440"/>
+      </w:pPr>
+    </w:lvl>
+  </w:abstractNum>
+  <w:abstractNum w:abstractNumId="13">
     <w:nsid w:val="58853D54"/>
     <w:multiLevelType w:val="hybridMultilevel"/>
     <w:tmpl w:val="F9A0FEE6"/>
@@ -6283,11 +6845,11 @@
       </w:pPr>
     </w:lvl>
   </w:abstractNum>
-  <w:abstractNum w:abstractNumId="12">
+  <w:abstractNum w:abstractNumId="14">
     <w:nsid w:val="5A401E09"/>
-    <w:multiLevelType w:val="hybridMultilevel"/>
-    <w:tmpl w:val="E60043F6"/>
-    <w:lvl w:ilvl="0" w:tplc="0409000F">
+    <w:multiLevelType w:val="multilevel"/>
+    <w:tmpl w:val="826AB178"/>
+    <w:lvl w:ilvl="0">
       <w:start w:val="1"/>
       <w:numFmt w:val="decimal"/>
       <w:lvlText w:val="%1."/>
@@ -6296,80 +6858,112 @@
         <w:ind w:left="720" w:hanging="360"/>
       </w:pPr>
     </w:lvl>
-    <w:lvl w:ilvl="1" w:tplc="04090019" w:tentative="1">
-      <w:start w:val="1"/>
-      <w:numFmt w:val="lowerLetter"/>
-      <w:lvlText w:val="%2."/>
-      <w:lvlJc w:val="left"/>
-      <w:pPr>
-        <w:ind w:left="1440" w:hanging="360"/>
-      </w:pPr>
-    </w:lvl>
-    <w:lvl w:ilvl="2" w:tplc="0409001B" w:tentative="1">
-      <w:start w:val="1"/>
-      <w:numFmt w:val="lowerRoman"/>
-      <w:lvlText w:val="%3."/>
-      <w:lvlJc w:val="right"/>
-      <w:pPr>
-        <w:ind w:left="2160" w:hanging="180"/>
-      </w:pPr>
-    </w:lvl>
-    <w:lvl w:ilvl="3" w:tplc="0409000F" w:tentative="1">
-      <w:start w:val="1"/>
+    <w:lvl w:ilvl="1">
+      <w:start w:val="6"/>
       <w:numFmt w:val="decimal"/>
-      <w:lvlText w:val="%4."/>
-      <w:lvlJc w:val="left"/>
-      <w:pPr>
-        <w:ind w:left="2880" w:hanging="360"/>
-      </w:pPr>
-    </w:lvl>
-    <w:lvl w:ilvl="4" w:tplc="04090019" w:tentative="1">
-      <w:start w:val="1"/>
-      <w:numFmt w:val="lowerLetter"/>
-      <w:lvlText w:val="%5."/>
-      <w:lvlJc w:val="left"/>
-      <w:pPr>
-        <w:ind w:left="3600" w:hanging="360"/>
-      </w:pPr>
-    </w:lvl>
-    <w:lvl w:ilvl="5" w:tplc="0409001B" w:tentative="1">
-      <w:start w:val="1"/>
-      <w:numFmt w:val="lowerRoman"/>
-      <w:lvlText w:val="%6."/>
-      <w:lvlJc w:val="right"/>
-      <w:pPr>
-        <w:ind w:left="4320" w:hanging="180"/>
-      </w:pPr>
-    </w:lvl>
-    <w:lvl w:ilvl="6" w:tplc="0409000F" w:tentative="1">
+      <w:isLgl/>
+      <w:lvlText w:val="%1.%2"/>
+      <w:lvlJc w:val="left"/>
+      <w:pPr>
+        <w:ind w:left="720" w:hanging="360"/>
+      </w:pPr>
+      <w:rPr>
+        <w:rFonts w:hint="default"/>
+      </w:rPr>
+    </w:lvl>
+    <w:lvl w:ilvl="2">
       <w:start w:val="1"/>
       <w:numFmt w:val="decimal"/>
-      <w:lvlText w:val="%7."/>
-      <w:lvlJc w:val="left"/>
-      <w:pPr>
-        <w:ind w:left="5040" w:hanging="360"/>
-      </w:pPr>
-    </w:lvl>
-    <w:lvl w:ilvl="7" w:tplc="04090019" w:tentative="1">
-      <w:start w:val="1"/>
-      <w:numFmt w:val="lowerLetter"/>
-      <w:lvlText w:val="%8."/>
-      <w:lvlJc w:val="left"/>
-      <w:pPr>
-        <w:ind w:left="5760" w:hanging="360"/>
-      </w:pPr>
-    </w:lvl>
-    <w:lvl w:ilvl="8" w:tplc="0409001B" w:tentative="1">
-      <w:start w:val="1"/>
-      <w:numFmt w:val="lowerRoman"/>
-      <w:lvlText w:val="%9."/>
-      <w:lvlJc w:val="right"/>
-      <w:pPr>
-        <w:ind w:left="6480" w:hanging="180"/>
-      </w:pPr>
+      <w:isLgl/>
+      <w:lvlText w:val="%1.%2.%3"/>
+      <w:lvlJc w:val="left"/>
+      <w:pPr>
+        <w:ind w:left="1080" w:hanging="720"/>
+      </w:pPr>
+      <w:rPr>
+        <w:rFonts w:hint="default"/>
+      </w:rPr>
+    </w:lvl>
+    <w:lvl w:ilvl="3">
+      <w:start w:val="1"/>
+      <w:numFmt w:val="decimal"/>
+      <w:isLgl/>
+      <w:lvlText w:val="%1.%2.%3.%4"/>
+      <w:lvlJc w:val="left"/>
+      <w:pPr>
+        <w:ind w:left="1080" w:hanging="720"/>
+      </w:pPr>
+      <w:rPr>
+        <w:rFonts w:hint="default"/>
+      </w:rPr>
+    </w:lvl>
+    <w:lvl w:ilvl="4">
+      <w:start w:val="1"/>
+      <w:numFmt w:val="decimal"/>
+      <w:isLgl/>
+      <w:lvlText w:val="%1.%2.%3.%4.%5"/>
+      <w:lvlJc w:val="left"/>
+      <w:pPr>
+        <w:ind w:left="1080" w:hanging="720"/>
+      </w:pPr>
+      <w:rPr>
+        <w:rFonts w:hint="default"/>
+      </w:rPr>
+    </w:lvl>
+    <w:lvl w:ilvl="5">
+      <w:start w:val="1"/>
+      <w:numFmt w:val="decimal"/>
+      <w:isLgl/>
+      <w:lvlText w:val="%1.%2.%3.%4.%5.%6"/>
+      <w:lvlJc w:val="left"/>
+      <w:pPr>
+        <w:ind w:left="1440" w:hanging="1080"/>
+      </w:pPr>
+      <w:rPr>
+        <w:rFonts w:hint="default"/>
+      </w:rPr>
+    </w:lvl>
+    <w:lvl w:ilvl="6">
+      <w:start w:val="1"/>
+      <w:numFmt w:val="decimal"/>
+      <w:isLgl/>
+      <w:lvlText w:val="%1.%2.%3.%4.%5.%6.%7"/>
+      <w:lvlJc w:val="left"/>
+      <w:pPr>
+        <w:ind w:left="1440" w:hanging="1080"/>
+      </w:pPr>
+      <w:rPr>
+        <w:rFonts w:hint="default"/>
+      </w:rPr>
+    </w:lvl>
+    <w:lvl w:ilvl="7">
+      <w:start w:val="1"/>
+      <w:numFmt w:val="decimal"/>
+      <w:isLgl/>
+      <w:lvlText w:val="%1.%2.%3.%4.%5.%6.%7.%8"/>
+      <w:lvlJc w:val="left"/>
+      <w:pPr>
+        <w:ind w:left="1800" w:hanging="1440"/>
+      </w:pPr>
+      <w:rPr>
+        <w:rFonts w:hint="default"/>
+      </w:rPr>
+    </w:lvl>
+    <w:lvl w:ilvl="8">
+      <w:start w:val="1"/>
+      <w:numFmt w:val="decimal"/>
+      <w:isLgl/>
+      <w:lvlText w:val="%1.%2.%3.%4.%5.%6.%7.%8.%9"/>
+      <w:lvlJc w:val="left"/>
+      <w:pPr>
+        <w:ind w:left="1800" w:hanging="1440"/>
+      </w:pPr>
+      <w:rPr>
+        <w:rFonts w:hint="default"/>
+      </w:rPr>
     </w:lvl>
   </w:abstractNum>
-  <w:abstractNum w:abstractNumId="13">
+  <w:abstractNum w:abstractNumId="15">
     <w:nsid w:val="5C1F6C6E"/>
     <w:multiLevelType w:val="hybridMultilevel"/>
     <w:tmpl w:val="1E784138"/>
@@ -6455,7 +7049,7 @@
       </w:pPr>
     </w:lvl>
   </w:abstractNum>
-  <w:abstractNum w:abstractNumId="14">
+  <w:abstractNum w:abstractNumId="16">
     <w:nsid w:val="682B1795"/>
     <w:multiLevelType w:val="hybridMultilevel"/>
     <w:tmpl w:val="FAF4E590"/>
@@ -6541,7 +7135,7 @@
       </w:pPr>
     </w:lvl>
   </w:abstractNum>
-  <w:abstractNum w:abstractNumId="15">
+  <w:abstractNum w:abstractNumId="17">
     <w:nsid w:val="692A3B4C"/>
     <w:multiLevelType w:val="hybridMultilevel"/>
     <w:tmpl w:val="49B2C9C2"/>
@@ -6627,7 +7221,7 @@
       </w:pPr>
     </w:lvl>
   </w:abstractNum>
-  <w:abstractNum w:abstractNumId="16">
+  <w:abstractNum w:abstractNumId="18">
     <w:nsid w:val="6B543C05"/>
     <w:multiLevelType w:val="hybridMultilevel"/>
     <w:tmpl w:val="84C84B48"/>
@@ -6713,7 +7307,7 @@
       </w:pPr>
     </w:lvl>
   </w:abstractNum>
-  <w:abstractNum w:abstractNumId="17">
+  <w:abstractNum w:abstractNumId="19">
     <w:nsid w:val="708D308C"/>
     <w:multiLevelType w:val="hybridMultilevel"/>
     <w:tmpl w:val="33B86E3A"/>
@@ -6799,7 +7393,7 @@
       </w:pPr>
     </w:lvl>
   </w:abstractNum>
-  <w:abstractNum w:abstractNumId="18">
+  <w:abstractNum w:abstractNumId="20">
     <w:nsid w:val="71884F75"/>
     <w:multiLevelType w:val="hybridMultilevel"/>
     <w:tmpl w:val="FAF4E590"/>
@@ -6885,7 +7479,7 @@
       </w:pPr>
     </w:lvl>
   </w:abstractNum>
-  <w:abstractNum w:abstractNumId="19">
+  <w:abstractNum w:abstractNumId="21">
     <w:nsid w:val="7CB570C6"/>
     <w:multiLevelType w:val="hybridMultilevel"/>
     <w:tmpl w:val="49BE94B2"/>
@@ -6975,64 +7569,70 @@
     </w:lvl>
   </w:abstractNum>
   <w:num w:numId="1">
-    <w:abstractNumId w:val="0"/>
+    <w:abstractNumId w:val="1"/>
   </w:num>
   <w:num w:numId="2">
+    <w:abstractNumId w:val="7"/>
+  </w:num>
+  <w:num w:numId="3">
+    <w:abstractNumId w:val="17"/>
+  </w:num>
+  <w:num w:numId="4">
+    <w:abstractNumId w:val="18"/>
+  </w:num>
+  <w:num w:numId="5">
+    <w:abstractNumId w:val="10"/>
+  </w:num>
+  <w:num w:numId="6">
+    <w:abstractNumId w:val="2"/>
+  </w:num>
+  <w:num w:numId="7">
+    <w:abstractNumId w:val="16"/>
+  </w:num>
+  <w:num w:numId="8">
+    <w:abstractNumId w:val="20"/>
+  </w:num>
+  <w:num w:numId="9">
+    <w:abstractNumId w:val="8"/>
+  </w:num>
+  <w:num w:numId="10">
+    <w:abstractNumId w:val="15"/>
+  </w:num>
+  <w:num w:numId="11">
+    <w:abstractNumId w:val="13"/>
+  </w:num>
+  <w:num w:numId="12">
+    <w:abstractNumId w:val="14"/>
+  </w:num>
+  <w:num w:numId="13">
+    <w:abstractNumId w:val="4"/>
+  </w:num>
+  <w:num w:numId="14">
+    <w:abstractNumId w:val="5"/>
+  </w:num>
+  <w:num w:numId="15">
+    <w:abstractNumId w:val="9"/>
+  </w:num>
+  <w:num w:numId="16">
+    <w:abstractNumId w:val="19"/>
+  </w:num>
+  <w:num w:numId="17">
+    <w:abstractNumId w:val="3"/>
+  </w:num>
+  <w:num w:numId="18">
+    <w:abstractNumId w:val="11"/>
+  </w:num>
+  <w:num w:numId="19">
+    <w:abstractNumId w:val="21"/>
+  </w:num>
+  <w:num w:numId="20">
     <w:abstractNumId w:val="6"/>
   </w:num>
-  <w:num w:numId="3">
-    <w:abstractNumId w:val="15"/>
-  </w:num>
-  <w:num w:numId="4">
-    <w:abstractNumId w:val="16"/>
-  </w:num>
-  <w:num w:numId="5">
-    <w:abstractNumId w:val="9"/>
-  </w:num>
-  <w:num w:numId="6">
-    <w:abstractNumId w:val="1"/>
-  </w:num>
-  <w:num w:numId="7">
-    <w:abstractNumId w:val="14"/>
-  </w:num>
-  <w:num w:numId="8">
-    <w:abstractNumId w:val="18"/>
-  </w:num>
-  <w:num w:numId="9">
-    <w:abstractNumId w:val="7"/>
-  </w:num>
-  <w:num w:numId="10">
-    <w:abstractNumId w:val="13"/>
-  </w:num>
-  <w:num w:numId="11">
-    <w:abstractNumId w:val="11"/>
-  </w:num>
-  <w:num w:numId="12">
+  <w:num w:numId="21">
     <w:abstractNumId w:val="12"/>
   </w:num>
-  <w:num w:numId="13">
-    <w:abstractNumId w:val="3"/>
-  </w:num>
-  <w:num w:numId="14">
-    <w:abstractNumId w:val="4"/>
-  </w:num>
-  <w:num w:numId="15">
-    <w:abstractNumId w:val="8"/>
-  </w:num>
-  <w:num w:numId="16">
-    <w:abstractNumId w:val="17"/>
-  </w:num>
-  <w:num w:numId="17">
-    <w:abstractNumId w:val="2"/>
-  </w:num>
-  <w:num w:numId="18">
-    <w:abstractNumId w:val="10"/>
-  </w:num>
-  <w:num w:numId="19">
-    <w:abstractNumId w:val="19"/>
-  </w:num>
-  <w:num w:numId="20">
-    <w:abstractNumId w:val="5"/>
+  <w:num w:numId="22">
+    <w:abstractNumId w:val="0"/>
   </w:num>
 </w:numbering>
 </file>
@@ -7065,9 +7665,9 @@
     <w:lsdException w:name="heading 7" w:uiPriority="9" w:qFormat="1"/>
     <w:lsdException w:name="heading 8" w:uiPriority="9" w:qFormat="1"/>
     <w:lsdException w:name="heading 9" w:uiPriority="9" w:qFormat="1"/>
-    <w:lsdException w:name="toc 1" w:uiPriority="39"/>
-    <w:lsdException w:name="toc 2" w:uiPriority="39"/>
-    <w:lsdException w:name="toc 3" w:uiPriority="39"/>
+    <w:lsdException w:name="toc 1" w:uiPriority="39" w:qFormat="1"/>
+    <w:lsdException w:name="toc 2" w:uiPriority="39" w:qFormat="1"/>
+    <w:lsdException w:name="toc 3" w:uiPriority="39" w:qFormat="1"/>
     <w:lsdException w:name="toc 4" w:uiPriority="39"/>
     <w:lsdException w:name="toc 5" w:uiPriority="39"/>
     <w:lsdException w:name="toc 6" w:uiPriority="39"/>
@@ -7671,6 +8271,7 @@
     <w:autoRedefine/>
     <w:uiPriority w:val="39"/>
     <w:unhideWhenUsed/>
+    <w:qFormat/>
     <w:rsid w:val="00E44CF8"/>
     <w:pPr>
       <w:spacing w:after="100"/>
@@ -7683,6 +8284,7 @@
     <w:autoRedefine/>
     <w:uiPriority w:val="39"/>
     <w:unhideWhenUsed/>
+    <w:qFormat/>
     <w:rsid w:val="00E44CF8"/>
     <w:pPr>
       <w:spacing w:after="100"/>
@@ -7696,6 +8298,7 @@
     <w:autoRedefine/>
     <w:uiPriority w:val="39"/>
     <w:unhideWhenUsed/>
+    <w:qFormat/>
     <w:rsid w:val="00E44CF8"/>
     <w:pPr>
       <w:spacing w:after="100"/>
@@ -8016,9 +8619,9 @@
     <w:lsdException w:name="heading 7" w:uiPriority="9" w:qFormat="1"/>
     <w:lsdException w:name="heading 8" w:uiPriority="9" w:qFormat="1"/>
     <w:lsdException w:name="heading 9" w:uiPriority="9" w:qFormat="1"/>
-    <w:lsdException w:name="toc 1" w:uiPriority="39"/>
-    <w:lsdException w:name="toc 2" w:uiPriority="39"/>
-    <w:lsdException w:name="toc 3" w:uiPriority="39"/>
+    <w:lsdException w:name="toc 1" w:uiPriority="39" w:qFormat="1"/>
+    <w:lsdException w:name="toc 2" w:uiPriority="39" w:qFormat="1"/>
+    <w:lsdException w:name="toc 3" w:uiPriority="39" w:qFormat="1"/>
     <w:lsdException w:name="toc 4" w:uiPriority="39"/>
     <w:lsdException w:name="toc 5" w:uiPriority="39"/>
     <w:lsdException w:name="toc 6" w:uiPriority="39"/>
@@ -8622,6 +9225,7 @@
     <w:autoRedefine/>
     <w:uiPriority w:val="39"/>
     <w:unhideWhenUsed/>
+    <w:qFormat/>
     <w:rsid w:val="00E44CF8"/>
     <w:pPr>
       <w:spacing w:after="100"/>
@@ -8634,6 +9238,7 @@
     <w:autoRedefine/>
     <w:uiPriority w:val="39"/>
     <w:unhideWhenUsed/>
+    <w:qFormat/>
     <w:rsid w:val="00E44CF8"/>
     <w:pPr>
       <w:spacing w:after="100"/>
@@ -8647,6 +9252,7 @@
     <w:autoRedefine/>
     <w:uiPriority w:val="39"/>
     <w:unhideWhenUsed/>
+    <w:qFormat/>
     <w:rsid w:val="00E44CF8"/>
     <w:pPr>
       <w:spacing w:after="100"/>
@@ -9227,7 +9833,7 @@
 </file>
 
 <file path=customXml/itemProps1.xml><?xml version="1.0" encoding="utf-8"?>
-<ds:datastoreItem xmlns:ds="http://schemas.openxmlformats.org/officeDocument/2006/customXml" ds:itemID="{A4AA4754-353A-435A-BC88-6A350C8946AE}">
+<ds:datastoreItem xmlns:ds="http://schemas.openxmlformats.org/officeDocument/2006/customXml" ds:itemID="{8A261842-C56B-47BA-AF15-BFB232DCBB79}">
   <ds:schemaRefs>
     <ds:schemaRef ds:uri="http://schemas.openxmlformats.org/officeDocument/2006/bibliography"/>
   </ds:schemaRefs>

</xml_diff>